<commit_message>
Agregar mantenimientos de categoria y proveedor, consultas de busqueda por nombre y actualizar documentacion
</commit_message>
<xml_diff>
--- a/docs/Documentacion_Proyecto_LP2.docx
+++ b/docs/Documentacion_Proyecto_LP2.docx
@@ -284,7 +284,7 @@
     </w:p>
     <w:p>
       <w:r>
-        <w:t>El presente proyecto describe el desarrollo e implementación de un sistema de información web para Café Origen S.A.C., una empresa dedicada al café de especialidad. El sistema constituye un panel de administración que centraliza el mantenimiento del catálogo de productos de la cafetería —organizados por categoría y abastecidos por distintos proveedores— y la gestión del personal del local, todo ello protegido mediante control de acceso por roles y complementado con reportes en formato PDF.</w:t>
+        <w:t>El presente proyecto describe el desarrollo e implementación de un sistema de información web para Café Origen S.A.C., una empresa dedicada al café de especialidad. El sistema es un panel de administración que centraliza el mantenimiento del catálogo de productos —organizados por categoría y abastecidos por proveedores— y la gestión del personal del local, con control de acceso por roles y reportes en formato PDF.</w:t>
       </w:r>
     </w:p>
     <w:p>
@@ -297,7 +297,7 @@
     </w:p>
     <w:p>
       <w:r>
-        <w:t>Anteriormente, Café Origen gestionaba de forma aislada el catálogo de productos y la información del personal mediante hojas de cálculo y registros manuales. Esta desintegración ocasionaba inconsistencias en el inventario, dificultad para mantener actualizada la relación de proveedores y categorías, y la imposibilidad de generar reportes confiables del catálogo y de la planilla de empleados de manera ágil.</w:t>
+        <w:t>Anteriormente, Café Origen gestionaba el catálogo de productos y la información del personal mediante hojas de cálculo y registros manuales. Esto ocasionaba inconsistencias en el inventario, dificultad para mantener actualizada la relación de proveedores y categorías, y la imposibilidad de generar reportes confiables de manera rápida.</w:t>
       </w:r>
     </w:p>
     <w:p>
@@ -309,11 +309,8 @@
       </w:r>
     </w:p>
     <w:p>
-      <w:pPr>
-        <w:pStyle w:val="ListBullet"/>
-      </w:pPr>
       <w:r>
-        <w:t>Centralizar el mantenimiento (registrar, modificar y dar de baja) del catálogo de productos, relacionando cada producto con su categoría y su proveedor.</w:t>
+        <w:t>Los objetivos se plantean siguiendo los criterios SMART (específicos, medibles, alcanzables, relevantes y con un plazo definido):</w:t>
       </w:r>
     </w:p>
     <w:p>
@@ -321,7 +318,7 @@
         <w:pStyle w:val="ListBullet"/>
       </w:pPr>
       <w:r>
-        <w:t>Administrar la planilla de empleados y sus credenciales de acceso al sistema.</w:t>
+        <w:t>Implementar, antes de finalizar el ciclo académico, cuatro módulos de mantenimiento (productos, categorías, proveedores y empleados) que permitan registrar, modificar y dar de baja el 100% de sus registros.</w:t>
       </w:r>
     </w:p>
     <w:p>
@@ -329,7 +326,7 @@
         <w:pStyle w:val="ListBullet"/>
       </w:pPr>
       <w:r>
-        <w:t>Implementar la baja lógica mediante un campo de estado, conservando el histórico de la información en lugar de eliminarla físicamente de la base de datos.</w:t>
+        <w:t>Reducir el tiempo de búsqueda de información mediante dos consultas (productos y empleados por nombre) que devuelvan los resultados de forma inmediata.</w:t>
       </w:r>
     </w:p>
     <w:p>
@@ -337,7 +334,7 @@
         <w:pStyle w:val="ListBullet"/>
       </w:pPr>
       <w:r>
-        <w:t>Proveer reportes en formato PDF del catálogo de productos y de la planilla de empleados a través de JasperReports.</w:t>
+        <w:t>Generar dos reportes en formato PDF (catálogo de productos y planilla de empleados) disponibles bajo demanda para la administración.</w:t>
       </w:r>
     </w:p>
     <w:p>
@@ -345,7 +342,103 @@
         <w:pStyle w:val="ListBullet"/>
       </w:pPr>
       <w:r>
-        <w:t>Garantizar la protección del sistema mediante validaciones de sesión HTTP y roles de acceso (Administrador y Recepcionista).</w:t>
+        <w:t>Garantizar la integridad de la información aplicando baja lógica en todos los mantenimientos y una operación transaccional en el alta de empleados.</w:t>
+      </w:r>
+    </w:p>
+    <w:p>
+      <w:pPr>
+        <w:pStyle w:val="Heading2"/>
+      </w:pPr>
+      <w:r>
+        <w:t>1.3. Diagnóstico (Análisis SEPTE)</w:t>
+      </w:r>
+    </w:p>
+    <w:p>
+      <w:r>
+        <w:t>Se analiza el entorno del negocio desde los cinco factores del análisis SEPTE:</w:t>
+      </w:r>
+    </w:p>
+    <w:p>
+      <w:pPr>
+        <w:pStyle w:val="ListBullet"/>
+      </w:pPr>
+      <w:r>
+        <w:rPr>
+          <w:b/>
+        </w:rPr>
+        <w:t xml:space="preserve">Social: </w:t>
+      </w:r>
+      <w:r>
+        <w:t>El consumo de café de especialidad ha crecido y los clientes valoran la variedad y la calidad. Un catálogo ordenado permite responder mejor a esa demanda.</w:t>
+      </w:r>
+    </w:p>
+    <w:p>
+      <w:pPr>
+        <w:pStyle w:val="ListBullet"/>
+      </w:pPr>
+      <w:r>
+        <w:rPr>
+          <w:b/>
+        </w:rPr>
+        <w:t xml:space="preserve">Económico: </w:t>
+      </w:r>
+      <w:r>
+        <w:t>Un buen control de inventario, categorías y proveedores reduce las pérdidas por desabastecimiento o productos vencidos y mejora la rentabilidad del negocio.</w:t>
+      </w:r>
+    </w:p>
+    <w:p>
+      <w:pPr>
+        <w:pStyle w:val="ListBullet"/>
+      </w:pPr>
+      <w:r>
+        <w:rPr>
+          <w:b/>
+        </w:rPr>
+        <w:t xml:space="preserve">Político / Legal: </w:t>
+      </w:r>
+      <w:r>
+        <w:t>La empresa debe cumplir las normas laborales y de formalización. El registro ordenado de los empleados y sus datos facilita dicho cumplimiento.</w:t>
+      </w:r>
+    </w:p>
+    <w:p>
+      <w:pPr>
+        <w:pStyle w:val="ListBullet"/>
+      </w:pPr>
+      <w:r>
+        <w:rPr>
+          <w:b/>
+        </w:rPr>
+        <w:t xml:space="preserve">Tecnológico: </w:t>
+      </w:r>
+      <w:r>
+        <w:t>La digitalización mediante una aplicación web (Spring Boot y MySQL) reemplaza las hojas de cálculo y los procesos manuales, agilizando la gestión administrativa.</w:t>
+      </w:r>
+    </w:p>
+    <w:p>
+      <w:pPr>
+        <w:pStyle w:val="ListBullet"/>
+      </w:pPr>
+      <w:r>
+        <w:rPr>
+          <w:b/>
+        </w:rPr>
+        <w:t xml:space="preserve">Ecológico: </w:t>
+      </w:r>
+      <w:r>
+        <w:t>Al digitalizar los reportes y registros se reduce el uso de papel, y la gestión de proveedores permite priorizar insumos de origen sostenible.</w:t>
+      </w:r>
+    </w:p>
+    <w:p>
+      <w:pPr>
+        <w:pStyle w:val="Heading2"/>
+      </w:pPr>
+      <w:r>
+        <w:t>1.4. Justificación del Proyecto</w:t>
+      </w:r>
+    </w:p>
+    <w:p>
+      <w:r>
+        <w:t>El proyecto se justifica porque centraliza y ordena la gestión administrativa de Café Origen S.A.C., que antes dependía de hojas de cálculo dispersas. Su principal aporte es reducir los errores de inventario y de registro de personal, agilizar la consulta de información y permitir reportes confiables para la toma de decisiones. Los beneficiarios directos son: la empresa (mejor control de su catálogo, proveedores y planilla), el personal administrativo y los recepcionistas (que realizan su trabajo de forma más rápida y ordenada) y, de manera indirecta, los clientes, que reciben una atención más eficiente.</w:t>
       </w:r>
     </w:p>
     <w:p>
@@ -1447,6 +1540,53 @@
           </w:p>
         </w:tc>
       </w:tr>
+      <w:tr>
+        <w:tc>
+          <w:tcPr>
+            <w:tcW w:type="dxa" w:w="2448"/>
+          </w:tcPr>
+          <w:p>
+            <w:r/>
+            <w:r>
+              <w:rPr>
+                <w:b w:val="0"/>
+                <w:sz w:val="20"/>
+              </w:rPr>
+              <w:t>estado</w:t>
+            </w:r>
+          </w:p>
+        </w:tc>
+        <w:tc>
+          <w:tcPr>
+            <w:tcW w:type="dxa" w:w="3312"/>
+          </w:tcPr>
+          <w:p>
+            <w:r/>
+            <w:r>
+              <w:rPr>
+                <w:b w:val="0"/>
+                <w:sz w:val="20"/>
+              </w:rPr>
+              <w:t>INT (NOT NULL DEFAULT 1)</w:t>
+            </w:r>
+          </w:p>
+        </w:tc>
+        <w:tc>
+          <w:tcPr>
+            <w:tcW w:type="dxa" w:w="3600"/>
+          </w:tcPr>
+          <w:p>
+            <w:r/>
+            <w:r>
+              <w:rPr>
+                <w:b w:val="0"/>
+                <w:sz w:val="20"/>
+              </w:rPr>
+              <w:t>Estado lógico (1 = Activo, 0 = Eliminado)</w:t>
+            </w:r>
+          </w:p>
+        </w:tc>
+      </w:tr>
     </w:tbl>
     <w:p>
       <w:pPr>
@@ -1716,6 +1856,53 @@
                 <w:sz w:val="20"/>
               </w:rPr>
               <w:t>Correo de contacto</w:t>
+            </w:r>
+          </w:p>
+        </w:tc>
+      </w:tr>
+      <w:tr>
+        <w:tc>
+          <w:tcPr>
+            <w:tcW w:type="dxa" w:w="2448"/>
+          </w:tcPr>
+          <w:p>
+            <w:r/>
+            <w:r>
+              <w:rPr>
+                <w:b w:val="0"/>
+                <w:sz w:val="20"/>
+              </w:rPr>
+              <w:t>estado</w:t>
+            </w:r>
+          </w:p>
+        </w:tc>
+        <w:tc>
+          <w:tcPr>
+            <w:tcW w:type="dxa" w:w="3312"/>
+          </w:tcPr>
+          <w:p>
+            <w:r/>
+            <w:r>
+              <w:rPr>
+                <w:b w:val="0"/>
+                <w:sz w:val="20"/>
+              </w:rPr>
+              <w:t>INT (NOT NULL DEFAULT 1)</w:t>
+            </w:r>
+          </w:p>
+        </w:tc>
+        <w:tc>
+          <w:tcPr>
+            <w:tcW w:type="dxa" w:w="3600"/>
+          </w:tcPr>
+          <w:p>
+            <w:r/>
+            <w:r>
+              <w:rPr>
+                <w:b w:val="0"/>
+                <w:sz w:val="20"/>
+              </w:rPr>
+              <w:t>Estado lógico (1 = Activo, 0 = Eliminado)</w:t>
             </w:r>
           </w:p>
         </w:tc>
@@ -2150,7 +2337,7 @@
     </w:p>
     <w:p>
       <w:r>
-        <w:t>El sistema expone funciones diferenciadas según el rol del usuario autenticado en la sesión.</w:t>
+        <w:t>El sistema expone las siguientes funciones según el rol del usuario autenticado en la sesión.</w:t>
       </w:r>
     </w:p>
     <w:p>
@@ -2163,7 +2350,7 @@
     </w:p>
     <w:p>
       <w:r>
-        <w:t>Permite validar las credenciales de los usuarios contra la tabla 'usuario', verificando además que la cuenta se encuentre activa (estado = 1). Carga en la sesión HTTP ('usuarioLogueado') los datos del usuario y lo deriva al panel principal. El cierre de sesión invalida la sesión actual y retorna al login.</w:t>
+        <w:t>Valida las credenciales contra la tabla 'usuario', verificando que la cuenta esté activa (estado = 1). Carga al usuario en la sesión HTTP y lo deriva al panel principal; el logout invalida la sesión.</w:t>
       </w:r>
     </w:p>
     <w:p>
@@ -2171,12 +2358,12 @@
         <w:rPr>
           <w:b/>
         </w:rPr>
-        <w:t>2. Gestión de Productos (CRUD en página única)</w:t>
+        <w:t>2. Mantenimiento de Productos</w:t>
       </w:r>
     </w:p>
     <w:p>
       <w:r>
-        <w:t>Permite registrar, modificar y dar de baja productos del catálogo desde una sola pantalla que combina el formulario y el listado. Cada producto se asocia a una Categoría y a un Proveedor mediante listas desplegables que se llenan dinámicamente desde la base de datos.</w:t>
+        <w:t>Registra, modifica y da de baja productos en una sola pantalla (formulario + listado). Cada producto se asocia a una categoría y a un proveedor mediante listas desplegables.</w:t>
       </w:r>
     </w:p>
     <w:p>
@@ -2184,12 +2371,12 @@
         <w:rPr>
           <w:b/>
         </w:rPr>
-        <w:t>3. Gestión de Empleados (Solo Administradores)</w:t>
+        <w:t>3. Mantenimiento de Categorías</w:t>
       </w:r>
     </w:p>
     <w:p>
       <w:r>
-        <w:t>Permite mantener la planilla de colaboradores y asignarles sus credenciales de acceso y rol del sistema. Cada empleado está vinculado a un Usuario, y este a su vez a un Rol. La sección se restringe estrictamente al rol Administrador.</w:t>
+        <w:t>Permite administrar las categorías con las que se clasifican los productos, en una pantalla de registro y listado.</w:t>
       </w:r>
     </w:p>
     <w:p>
@@ -2197,12 +2384,12 @@
         <w:rPr>
           <w:b/>
         </w:rPr>
-        <w:t>4. Baja Lógica (campo estado)</w:t>
+        <w:t>4. Mantenimiento de Proveedores</w:t>
       </w:r>
     </w:p>
     <w:p>
       <w:r>
-        <w:t>En lugar de eliminar físicamente los registros, las operaciones de eliminación cambian el campo 'estado' a 0. Los listados muestran únicamente los registros activos (estado = 1), conservando el histórico de la información en la base de datos.</w:t>
+        <w:t>Permite administrar las empresas proveedoras (razón social, teléfono y correo) que abastecen el catálogo.</w:t>
       </w:r>
     </w:p>
     <w:p>
@@ -2210,12 +2397,12 @@
         <w:rPr>
           <w:b/>
         </w:rPr>
-        <w:t>5. Generación de Reportes PDF (JasperReports)</w:t>
+        <w:t>5. Mantenimiento de Empleados (Solo Administradores)</w:t>
       </w:r>
     </w:p>
     <w:p>
       <w:r>
-        <w:t>Consiste en dos reportes dinámicos. El primero lista el catálogo de productos junto con su categoría y proveedor; el segundo presenta la planilla de empleados con su cargo y rol de acceso. Ambos se compilan, rellenan desde la base de datos y exportan a PDF en caliente.</w:t>
+        <w:t>Mantiene la planilla de colaboradores y sus credenciales de acceso. Cada empleado se vincula a un usuario y este a un rol. La sección se restringe al rol Administrador.</w:t>
       </w:r>
     </w:p>
     <w:p>
@@ -2223,12 +2410,64 @@
         <w:rPr>
           <w:b/>
         </w:rPr>
-        <w:t>6. Documentación Interactiva de la API (Swagger/OpenAPI)</w:t>
+        <w:t>6. Consultas de Búsqueda</w:t>
       </w:r>
     </w:p>
     <w:p>
       <w:r>
-        <w:t>Permite documentar y probar de forma interactiva los endpoints de los controladores de Spring Boot. Habilitado mediante Springdoc, la interfaz visual es accesible desde /swagger-ui/index.html.</w:t>
+        <w:t>Permite buscar productos y empleados por su nombre. Cada consulta filtra el listado mostrando solo los registros activos que coinciden con el texto ingresado.</w:t>
+      </w:r>
+    </w:p>
+    <w:p>
+      <w:r>
+        <w:rPr>
+          <w:b/>
+        </w:rPr>
+        <w:t>7. Baja Lógica</w:t>
+      </w:r>
+    </w:p>
+    <w:p>
+      <w:r>
+        <w:t>Las eliminaciones cambian el campo 'estado' a 0 en lugar de borrar el registro. Los listados muestran únicamente los activos (estado = 1), conservando el histórico.</w:t>
+      </w:r>
+    </w:p>
+    <w:p>
+      <w:r>
+        <w:rPr>
+          <w:b/>
+        </w:rPr>
+        <w:t>8. Reportes PDF (JasperReports)</w:t>
+      </w:r>
+    </w:p>
+    <w:p>
+      <w:r>
+        <w:t>Genera dos reportes: el catálogo de productos (con su categoría y proveedor) y la planilla de empleados (con su cargo y rol). Se cargan precompilados (.jasper) y se exportan a PDF.</w:t>
+      </w:r>
+    </w:p>
+    <w:p>
+      <w:r>
+        <w:rPr>
+          <w:b/>
+        </w:rPr>
+        <w:t>9. Transacción (Alta de Empleado)</w:t>
+      </w:r>
+    </w:p>
+    <w:p>
+      <w:r>
+        <w:t>El registro de un empleado crea de forma atómica el usuario y el empleado dentro de una misma transacción (@Transactional): si algo falla, no se guarda ninguno de los dos.</w:t>
+      </w:r>
+    </w:p>
+    <w:p>
+      <w:r>
+        <w:rPr>
+          <w:b/>
+        </w:rPr>
+        <w:t>10. Documentación de la API (Swagger/OpenAPI)</w:t>
+      </w:r>
+    </w:p>
+    <w:p>
+      <w:r>
+        <w:t>Documenta y permite probar los endpoints de los controladores desde /swagger-ui/index.html.</w:t>
       </w:r>
     </w:p>
     <w:p>
@@ -2252,7 +2491,7 @@
         <w:t xml:space="preserve">Capa Modelo (Entities): </w:t>
       </w:r>
       <w:r>
-        <w:t>Clases Java anotadas con JPA/Jakarta Persistence (como 'Producto.java' y 'Empleado.java') que mapean directamente a las tablas en MySQL. Las relaciones se resuelven con la llave foránea (por ejemplo 'idCategoria') y un objeto de solo lectura asociado ('objCategoria') para mostrar su descripción.</w:t>
+        <w:t>Clases Java anotadas con JPA/Jakarta Persistence (Producto, Categoria, Proveedor, Empleado, Usuario, Rol) que mapean las tablas de MySQL. Las relaciones se resuelven con la llave foránea (ej. 'idCategoria') y un objeto de solo lectura asociado ('objCategoria') para mostrar su descripción.</w:t>
       </w:r>
     </w:p>
     <w:p>
@@ -2263,7 +2502,7 @@
         <w:t xml:space="preserve">Capa Repositorio (DAOs): </w:t>
       </w:r>
       <w:r>
-        <w:t>Interfaces que extienden 'JpaRepository' de Spring Data JPA. Proveen las operaciones del CRUD y métodos personalizados como 'findByEmailAndPassword' y 'findByEstadoOrderByIdProductoDesc'.</w:t>
+        <w:t>Interfaces que extienden 'JpaRepository' de Spring Data JPA. Proveen el CRUD y métodos personalizados como 'findByEmailAndPassword' o 'findByEstadoAndNombreContaining' usados en las consultas.</w:t>
       </w:r>
     </w:p>
     <w:p>
@@ -2274,7 +2513,7 @@
         <w:t xml:space="preserve">Capa Controlador (Controllers): </w:t>
       </w:r>
       <w:r>
-        <w:t>Intermedia entre el cliente web y el backend. Maneja las peticiones HTTP (GET, POST), realiza la validación de la sesión y de los roles, y asocia los datos al modelo de las vistas Thymeleaf.</w:t>
+        <w:t>Maneja las peticiones HTTP (GET, POST) de cada mantenimiento (productos, categorías, proveedores y empleados), valida la sesión y los roles, y asocia los datos a las vistas.</w:t>
       </w:r>
     </w:p>
     <w:p>
@@ -2285,7 +2524,7 @@
         <w:t xml:space="preserve">Capa Vista (Templates): </w:t>
       </w:r>
       <w:r>
-        <w:t>Páginas HTML5 enriquecidas con atributos 'th:text', 'th:each' y 'th:if' de Thymeleaf, con renderizado dinámico en el servidor y estilizadas con Bootstrap 5. Se modulariza mediante fragmentos ('fragments/navegacion.html') y se apoya en 'WebConfig.java' para servir recursos estáticos.</w:t>
+        <w:t>Páginas HTML5 con atributos 'th:text', 'th:each' y 'th:if' de Thymeleaf, estilizadas con Bootstrap 5 y modularizadas con fragmentos ('fragments/navegacion.html').</w:t>
       </w:r>
     </w:p>
     <w:p>
@@ -2306,7 +2545,7 @@
         <w:pStyle w:val="ListNumber"/>
       </w:pPr>
       <w:r>
-        <w:t>Restaurar la Base de Datos: abre MySQL Workbench, carga el script 'database/script.sql' y ejecútalo por completo. Esto creará la base de datos 'db_cafeorigen', sus tablas y sembrará los datos de prueba.</w:t>
+        <w:t>Restaurar la Base de Datos: abre MySQL Workbench, carga el script 'database/script.sql' y ejecútalo por completo. Esto crea la base de datos 'db_cafeorigen', sus tablas y los datos de prueba.</w:t>
       </w:r>
     </w:p>
     <w:p>
@@ -2314,7 +2553,7 @@
         <w:pStyle w:val="ListNumber"/>
       </w:pPr>
       <w:r>
-        <w:t>Configurar Propiedades: abre 'src/main/resources/application.properties' y verifica la contraseña de tu conexión local a MySQL (campo 'spring.datasource.password'). El puerto del servidor está configurado en el 8090.</w:t>
+        <w:t>Configurar Propiedades: abre 'src/main/resources/application.properties' y verifica la contraseña de tu conexión a MySQL. El servidor usa el puerto 8090.</w:t>
       </w:r>
     </w:p>
     <w:p>
@@ -2322,7 +2561,7 @@
         <w:pStyle w:val="ListNumber"/>
       </w:pPr>
       <w:r>
-        <w:t>Importar Proyecto Maven: en Eclipse o Spring Tool Suite, selecciona 'File' -&gt; 'Import' -&gt; 'Existing Maven Projects'. Elige la carpeta raíz y haz clic en 'Finish'. El IDE descargará todas las librerías automáticamente.</w:t>
+        <w:t>Importar Proyecto Maven: en Eclipse o Spring Tool Suite, usa 'File' -&gt; 'Import' -&gt; 'Existing Maven Projects', elige la carpeta raíz y pulsa 'Finish'.</w:t>
       </w:r>
     </w:p>
     <w:p>
@@ -2330,7 +2569,7 @@
         <w:pStyle w:val="ListNumber"/>
       </w:pPr>
       <w:r>
-        <w:t>Ejecutar: haz clic derecho en el proyecto -&gt; 'Run As' -&gt; 'Spring Boot App' (o ejecuta la clase 'Lp2Application.java').</w:t>
+        <w:t>Ejecutar: clic derecho en el proyecto -&gt; 'Run As' -&gt; 'Spring Boot App' (o ejecuta 'Lp2Application.java').</w:t>
       </w:r>
     </w:p>
     <w:p>
@@ -2338,12 +2577,7 @@
         <w:pStyle w:val="ListNumber"/>
       </w:pPr>
       <w:r>
-        <w:t>Acceder: abre el navegador en 'http://localhost:8090'. Inicia sesión con las credenciales del script (por ejemplo admin@cafeorigen.pe / admin123). La documentación interactiva de la API está disponible en 'http://localhost:8090/swagger-ui/index.html'.</w:t>
-      </w:r>
-    </w:p>
-    <w:p>
-      <w:r>
-        <w:br w:type="page"/>
+        <w:t>Acceder: abre 'http://localhost:8090' e inicia sesión con admin@cafeorigen.pe / admin123. La API está en 'http://localhost:8090/swagger-ui/index.html'.</w:t>
       </w:r>
     </w:p>
     <w:p>
@@ -2351,307 +2585,40 @@
         <w:pStyle w:val="Heading1"/>
       </w:pPr>
       <w:r>
-        <w:t>ANEXO A. CAPTURAS DE PANTALLA</w:t>
-      </w:r>
-    </w:p>
-    <w:p>
-      <w:r>
-        <w:t>A continuación se presentan las pantallas principales del sistema en funcionamiento. Reemplace cada recuadro por la captura correspondiente tomada al ejecutar el aplicativo.</w:t>
+        <w:t>6. CONCLUSIONES</w:t>
       </w:r>
     </w:p>
     <w:p>
       <w:pPr>
-        <w:pStyle w:val="Heading2"/>
+        <w:pStyle w:val="ListBullet"/>
       </w:pPr>
       <w:r>
-        <w:t>A.1. Inicio de Sesión</w:t>
+        <w:t>Se implementó un panel de administración funcional que cubre cuatro mantenimientos (productos, categorías, proveedores y empleados) con baja lógica, conservando el histórico de los datos.</w:t>
       </w:r>
-    </w:p>
-    <w:tbl>
-      <w:tblPr>
-        <w:tblStyle w:val="TableGrid"/>
-        <w:tblW w:type="auto" w:w="0"/>
-        <w:jc w:val="center"/>
-        <w:tblLayout w:type="fixed"/>
-        <w:tblLook w:firstColumn="1" w:firstRow="1" w:lastColumn="0" w:lastRow="0" w:noHBand="0" w:noVBand="1" w:val="04A0"/>
-      </w:tblPr>
-      <w:tblGrid>
-        <w:gridCol w:w="9360"/>
-      </w:tblGrid>
-      <w:tr>
-        <w:trPr>
-          <w:trHeight w:val="3888" w:hRule="atLeast"/>
-        </w:trPr>
-        <w:tc>
-          <w:tcPr>
-            <w:tcW w:type="dxa" w:w="9360"/>
-            <w:shd w:val="clear" w:color="auto" w:fill="F1EEEA"/>
-          </w:tcPr>
-          <w:p>
-            <w:pPr>
-              <w:jc w:val="center"/>
-            </w:pPr>
-            <w:r>
-              <w:rPr>
-                <w:i/>
-                <w:color w:val="7E726B"/>
-                <w:sz w:val="20"/>
-              </w:rPr>
-              <w:t>[ Inserte aquí la captura: Pantalla de Login ]</w:t>
-            </w:r>
-          </w:p>
-        </w:tc>
-      </w:tr>
-    </w:tbl>
-    <w:p>
-      <w:pPr>
-        <w:spacing w:after="120"/>
-      </w:pPr>
     </w:p>
     <w:p>
       <w:pPr>
-        <w:pStyle w:val="Heading2"/>
+        <w:pStyle w:val="ListBullet"/>
       </w:pPr>
       <w:r>
-        <w:t>A.2. Panel Principal</w:t>
+        <w:t>Las relaciones entre tablas (producto con categoría y proveedor; empleado con usuario y rol) se resolvieron con JPA, demostrando un modelo de datos normalizado y coherente.</w:t>
       </w:r>
-    </w:p>
-    <w:tbl>
-      <w:tblPr>
-        <w:tblStyle w:val="TableGrid"/>
-        <w:tblW w:type="auto" w:w="0"/>
-        <w:jc w:val="center"/>
-        <w:tblLayout w:type="fixed"/>
-        <w:tblLook w:firstColumn="1" w:firstRow="1" w:lastColumn="0" w:lastRow="0" w:noHBand="0" w:noVBand="1" w:val="04A0"/>
-      </w:tblPr>
-      <w:tblGrid>
-        <w:gridCol w:w="9360"/>
-      </w:tblGrid>
-      <w:tr>
-        <w:trPr>
-          <w:trHeight w:val="3888" w:hRule="atLeast"/>
-        </w:trPr>
-        <w:tc>
-          <w:tcPr>
-            <w:tcW w:type="dxa" w:w="9360"/>
-            <w:shd w:val="clear" w:color="auto" w:fill="F1EEEA"/>
-          </w:tcPr>
-          <w:p>
-            <w:pPr>
-              <w:jc w:val="center"/>
-            </w:pPr>
-            <w:r>
-              <w:rPr>
-                <w:i/>
-                <w:color w:val="7E726B"/>
-                <w:sz w:val="20"/>
-              </w:rPr>
-              <w:t>[ Inserte aquí la captura: Panel Principal (Dashboard) ]</w:t>
-            </w:r>
-          </w:p>
-        </w:tc>
-      </w:tr>
-    </w:tbl>
-    <w:p>
-      <w:pPr>
-        <w:spacing w:after="120"/>
-      </w:pPr>
     </w:p>
     <w:p>
       <w:pPr>
-        <w:pStyle w:val="Heading2"/>
+        <w:pStyle w:val="ListBullet"/>
       </w:pPr>
       <w:r>
-        <w:t>A.3. Mantenimiento de Productos</w:t>
+        <w:t>Las dos consultas de búsqueda y los dos reportes en PDF permiten obtener información del catálogo y del personal de forma rápida y confiable.</w:t>
       </w:r>
-    </w:p>
-    <w:tbl>
-      <w:tblPr>
-        <w:tblStyle w:val="TableGrid"/>
-        <w:tblW w:type="auto" w:w="0"/>
-        <w:jc w:val="center"/>
-        <w:tblLayout w:type="fixed"/>
-        <w:tblLook w:firstColumn="1" w:firstRow="1" w:lastColumn="0" w:lastRow="0" w:noHBand="0" w:noVBand="1" w:val="04A0"/>
-      </w:tblPr>
-      <w:tblGrid>
-        <w:gridCol w:w="9360"/>
-      </w:tblGrid>
-      <w:tr>
-        <w:trPr>
-          <w:trHeight w:val="3888" w:hRule="atLeast"/>
-        </w:trPr>
-        <w:tc>
-          <w:tcPr>
-            <w:tcW w:type="dxa" w:w="9360"/>
-            <w:shd w:val="clear" w:color="auto" w:fill="F1EEEA"/>
-          </w:tcPr>
-          <w:p>
-            <w:pPr>
-              <w:jc w:val="center"/>
-            </w:pPr>
-            <w:r>
-              <w:rPr>
-                <w:i/>
-                <w:color w:val="7E726B"/>
-                <w:sz w:val="20"/>
-              </w:rPr>
-              <w:t>[ Inserte aquí la captura: CRUD de Productos ]</w:t>
-            </w:r>
-          </w:p>
-        </w:tc>
-      </w:tr>
-    </w:tbl>
-    <w:p>
-      <w:pPr>
-        <w:spacing w:after="120"/>
-      </w:pPr>
     </w:p>
     <w:p>
       <w:pPr>
-        <w:pStyle w:val="Heading2"/>
+        <w:pStyle w:val="ListBullet"/>
       </w:pPr>
       <w:r>
-        <w:t>A.4. Mantenimiento de Empleados</w:t>
+        <w:t>La operación transaccional en el alta de empleados garantiza que el usuario y el empleado se registren de manera consistente, evitando datos incompletos.</w:t>
       </w:r>
-    </w:p>
-    <w:tbl>
-      <w:tblPr>
-        <w:tblStyle w:val="TableGrid"/>
-        <w:tblW w:type="auto" w:w="0"/>
-        <w:jc w:val="center"/>
-        <w:tblLayout w:type="fixed"/>
-        <w:tblLook w:firstColumn="1" w:firstRow="1" w:lastColumn="0" w:lastRow="0" w:noHBand="0" w:noVBand="1" w:val="04A0"/>
-      </w:tblPr>
-      <w:tblGrid>
-        <w:gridCol w:w="9360"/>
-      </w:tblGrid>
-      <w:tr>
-        <w:trPr>
-          <w:trHeight w:val="3888" w:hRule="atLeast"/>
-        </w:trPr>
-        <w:tc>
-          <w:tcPr>
-            <w:tcW w:type="dxa" w:w="9360"/>
-            <w:shd w:val="clear" w:color="auto" w:fill="F1EEEA"/>
-          </w:tcPr>
-          <w:p>
-            <w:pPr>
-              <w:jc w:val="center"/>
-            </w:pPr>
-            <w:r>
-              <w:rPr>
-                <w:i/>
-                <w:color w:val="7E726B"/>
-                <w:sz w:val="20"/>
-              </w:rPr>
-              <w:t>[ Inserte aquí la captura: CRUD de Empleados ]</w:t>
-            </w:r>
-          </w:p>
-        </w:tc>
-      </w:tr>
-    </w:tbl>
-    <w:p>
-      <w:pPr>
-        <w:spacing w:after="120"/>
-      </w:pPr>
-    </w:p>
-    <w:p>
-      <w:pPr>
-        <w:pStyle w:val="Heading2"/>
-      </w:pPr>
-      <w:r>
-        <w:t>A.5. Reporte PDF de Productos</w:t>
-      </w:r>
-    </w:p>
-    <w:tbl>
-      <w:tblPr>
-        <w:tblStyle w:val="TableGrid"/>
-        <w:tblW w:type="auto" w:w="0"/>
-        <w:jc w:val="center"/>
-        <w:tblLayout w:type="fixed"/>
-        <w:tblLook w:firstColumn="1" w:firstRow="1" w:lastColumn="0" w:lastRow="0" w:noHBand="0" w:noVBand="1" w:val="04A0"/>
-      </w:tblPr>
-      <w:tblGrid>
-        <w:gridCol w:w="9360"/>
-      </w:tblGrid>
-      <w:tr>
-        <w:trPr>
-          <w:trHeight w:val="3888" w:hRule="atLeast"/>
-        </w:trPr>
-        <w:tc>
-          <w:tcPr>
-            <w:tcW w:type="dxa" w:w="9360"/>
-            <w:shd w:val="clear" w:color="auto" w:fill="F1EEEA"/>
-          </w:tcPr>
-          <w:p>
-            <w:pPr>
-              <w:jc w:val="center"/>
-            </w:pPr>
-            <w:r>
-              <w:rPr>
-                <w:i/>
-                <w:color w:val="7E726B"/>
-                <w:sz w:val="20"/>
-              </w:rPr>
-              <w:t>[ Inserte aquí la captura: Reporte PDF de Productos ]</w:t>
-            </w:r>
-          </w:p>
-        </w:tc>
-      </w:tr>
-    </w:tbl>
-    <w:p>
-      <w:pPr>
-        <w:spacing w:after="120"/>
-      </w:pPr>
-    </w:p>
-    <w:p>
-      <w:pPr>
-        <w:pStyle w:val="Heading2"/>
-      </w:pPr>
-      <w:r>
-        <w:t>A.6. Reporte PDF de Empleados</w:t>
-      </w:r>
-    </w:p>
-    <w:tbl>
-      <w:tblPr>
-        <w:tblStyle w:val="TableGrid"/>
-        <w:tblW w:type="auto" w:w="0"/>
-        <w:jc w:val="center"/>
-        <w:tblLayout w:type="fixed"/>
-        <w:tblLook w:firstColumn="1" w:firstRow="1" w:lastColumn="0" w:lastRow="0" w:noHBand="0" w:noVBand="1" w:val="04A0"/>
-      </w:tblPr>
-      <w:tblGrid>
-        <w:gridCol w:w="9360"/>
-      </w:tblGrid>
-      <w:tr>
-        <w:trPr>
-          <w:trHeight w:val="3888" w:hRule="atLeast"/>
-        </w:trPr>
-        <w:tc>
-          <w:tcPr>
-            <w:tcW w:type="dxa" w:w="9360"/>
-            <w:shd w:val="clear" w:color="auto" w:fill="F1EEEA"/>
-          </w:tcPr>
-          <w:p>
-            <w:pPr>
-              <w:jc w:val="center"/>
-            </w:pPr>
-            <w:r>
-              <w:rPr>
-                <w:i/>
-                <w:color w:val="7E726B"/>
-                <w:sz w:val="20"/>
-              </w:rPr>
-              <w:t>[ Inserte aquí la captura: Reporte PDF de Empleados ]</w:t>
-            </w:r>
-          </w:p>
-        </w:tc>
-      </w:tr>
-    </w:tbl>
-    <w:p>
-      <w:pPr>
-        <w:spacing w:after="120"/>
-      </w:pPr>
     </w:p>
     <w:sectPr>
       <w:pgSz w:w="12240" w:h="15840"/>

</xml_diff>

<commit_message>
Agregar consultas SELECT al script de BD, corregir reporte de empleados y actualizar informe y configuracion
</commit_message>
<xml_diff>
--- a/docs/Documentacion_Proyecto_LP2.docx
+++ b/docs/Documentacion_Proyecto_LP2.docx
@@ -4,8 +4,46 @@
   <w:body>
     <w:p>
       <w:pPr>
-        <w:spacing w:after="120"/>
+        <w:spacing w:after="200"/>
+        <w:jc w:val="center"/>
       </w:pPr>
+      <w:r>
+        <w:rPr>
+          <w:b w:val="0"/>
+          <w:i/>
+          <w:sz w:val="22"/>
+        </w:rPr>
+        <w:t>“Año de la Esperanza y el Fortalecimiento de la Democracia”</w:t>
+      </w:r>
+    </w:p>
+    <w:p>
+      <w:pPr>
+        <w:spacing w:after="40"/>
+        <w:jc w:val="center"/>
+      </w:pPr>
+      <w:r>
+        <w:rPr>
+          <w:b/>
+          <w:i w:val="0"/>
+          <w:color w:val="6F4E37"/>
+          <w:sz w:val="26"/>
+        </w:rPr>
+        <w:t>INSTITUTO SUPERIOR TECNOLÓGICO CIBERTEC</w:t>
+      </w:r>
+    </w:p>
+    <w:p>
+      <w:pPr>
+        <w:spacing w:after="200"/>
+        <w:jc w:val="center"/>
+      </w:pPr>
+      <w:r>
+        <w:rPr>
+          <w:b/>
+          <w:i w:val="0"/>
+          <w:sz w:val="24"/>
+        </w:rPr>
+        <w:t>LENGUAJE DE PROGRAMACIÓN II</w:t>
+      </w:r>
     </w:p>
     <w:p>
       <w:pPr>
@@ -14,7 +52,7 @@
       <w:r>
         <w:drawing>
           <wp:inline xmlns:a="http://schemas.openxmlformats.org/drawingml/2006/main" xmlns:pic="http://schemas.openxmlformats.org/drawingml/2006/picture">
-            <wp:extent cx="1554480" cy="1364364"/>
+            <wp:extent cx="1463040" cy="1284107"/>
             <wp:docPr id="1" name="Picture 1"/>
             <wp:cNvGraphicFramePr>
               <a:graphicFrameLocks noChangeAspect="1"/>
@@ -35,7 +73,7 @@
                   <pic:spPr>
                     <a:xfrm>
                       <a:off x="0" y="0"/>
-                      <a:ext cx="1554480" cy="1364364"/>
+                      <a:ext cx="1463040" cy="1284107"/>
                     </a:xfrm>
                     <a:prstGeom prst="rect"/>
                   </pic:spPr>
@@ -48,16 +86,17 @@
     </w:p>
     <w:p>
       <w:pPr>
-        <w:spacing w:after="120"/>
+        <w:spacing w:after="80"/>
         <w:jc w:val="center"/>
       </w:pPr>
       <w:r>
         <w:rPr>
           <w:b/>
+          <w:i w:val="0"/>
           <w:color w:val="6F4E37"/>
-          <w:sz w:val="36"/>
+          <w:sz w:val="32"/>
         </w:rPr>
-        <w:t>INFORME ACADÉMICO DE PROYECTO FINAL</w:t>
+        <w:t>INFORME DE PROYECTO FINAL</w:t>
       </w:r>
     </w:p>
     <w:p>
@@ -68,6 +107,7 @@
       <w:r>
         <w:rPr>
           <w:b/>
+          <w:i w:val="0"/>
           <w:sz w:val="26"/>
         </w:rPr>
         <w:t>Sistema de Gestión de Catálogo de Productos y Personal</w:t>
@@ -75,12 +115,13 @@
     </w:p>
     <w:p>
       <w:pPr>
-        <w:spacing w:after="280"/>
+        <w:spacing w:after="240"/>
         <w:jc w:val="center"/>
       </w:pPr>
       <w:r>
         <w:rPr>
           <w:b w:val="0"/>
+          <w:i w:val="0"/>
           <w:sz w:val="24"/>
         </w:rPr>
         <w:t>Marca Comercial: Café Origen S.A.C.</w:t>
@@ -88,15 +129,44 @@
     </w:p>
     <w:p>
       <w:pPr>
-        <w:spacing w:after="0"/>
+        <w:spacing w:after="120"/>
         <w:jc w:val="center"/>
       </w:pPr>
       <w:r>
         <w:rPr>
           <w:b/>
+          <w:i w:val="0"/>
           <w:sz w:val="22"/>
         </w:rPr>
-        <w:t>Curso:</w:t>
+        <w:t>DOCENTE: JOSE AUGUSTO ATUNCAR GUZMAN</w:t>
+      </w:r>
+    </w:p>
+    <w:p>
+      <w:pPr>
+        <w:spacing w:after="240"/>
+        <w:jc w:val="center"/>
+      </w:pPr>
+      <w:r>
+        <w:rPr>
+          <w:b w:val="0"/>
+          <w:i w:val="0"/>
+          <w:sz w:val="22"/>
+        </w:rPr>
+        <w:t>Ciclo: Cuarto      Sección: B65      Semestre: 202605</w:t>
+      </w:r>
+    </w:p>
+    <w:p>
+      <w:pPr>
+        <w:spacing w:after="80"/>
+        <w:jc w:val="center"/>
+      </w:pPr>
+      <w:r>
+        <w:rPr>
+          <w:b/>
+          <w:i w:val="0"/>
+          <w:sz w:val="22"/>
+        </w:rPr>
+        <w:t>INTEGRANTES:</w:t>
       </w:r>
     </w:p>
     <w:p>
@@ -107,48 +177,10 @@
       <w:r>
         <w:rPr>
           <w:b w:val="0"/>
+          <w:i w:val="0"/>
           <w:sz w:val="22"/>
         </w:rPr>
-        <w:t>Lenguaje de Programación II (LP2)</w:t>
-      </w:r>
-    </w:p>
-    <w:p>
-      <w:pPr>
-        <w:spacing w:after="280"/>
-        <w:jc w:val="center"/>
-      </w:pPr>
-      <w:r>
-        <w:rPr>
-          <w:b w:val="0"/>
-          <w:sz w:val="22"/>
-        </w:rPr>
-        <w:t>Cibertec</w:t>
-      </w:r>
-    </w:p>
-    <w:p>
-      <w:pPr>
-        <w:spacing w:after="240"/>
-        <w:jc w:val="center"/>
-      </w:pPr>
-      <w:r>
-        <w:rPr>
-          <w:b w:val="0"/>
-          <w:sz w:val="22"/>
-        </w:rPr>
-        <w:t>Docente: Profesor del Curso</w:t>
-      </w:r>
-    </w:p>
-    <w:p>
-      <w:pPr>
-        <w:spacing w:after="80"/>
-        <w:jc w:val="center"/>
-      </w:pPr>
-      <w:r>
-        <w:rPr>
-          <w:b/>
-          <w:sz w:val="22"/>
-        </w:rPr>
-        <w:t>Integrantes del Grupo de Proyecto:</w:t>
+        <w:t>José Miguel Montalva Bruzzón — i202511193</w:t>
       </w:r>
     </w:p>
     <w:p>
@@ -159,9 +191,10 @@
       <w:r>
         <w:rPr>
           <w:b w:val="0"/>
+          <w:i w:val="0"/>
           <w:sz w:val="22"/>
         </w:rPr>
-        <w:t>José Miguel Montalva Bruzzón - i202511193</w:t>
+        <w:t>Kristy Rivas Luza — i202403564</w:t>
       </w:r>
     </w:p>
     <w:p>
@@ -172,9 +205,10 @@
       <w:r>
         <w:rPr>
           <w:b w:val="0"/>
+          <w:i w:val="0"/>
           <w:sz w:val="22"/>
         </w:rPr>
-        <w:t>Kristy Rivas Luza - i202403564</w:t>
+        <w:t>Ricardo Sebastián Gonzales Sánchez — i202511011</w:t>
       </w:r>
     </w:p>
     <w:p>
@@ -185,32 +219,21 @@
       <w:r>
         <w:rPr>
           <w:b w:val="0"/>
+          <w:i w:val="0"/>
           <w:sz w:val="22"/>
         </w:rPr>
-        <w:t>Ricardo Sebastian Gonzales Sanchez - i202511011</w:t>
+        <w:t>Josefina Aledo Velasquez — i202215311</w:t>
       </w:r>
     </w:p>
     <w:p>
       <w:pPr>
-        <w:spacing w:after="0"/>
+        <w:spacing w:after="200"/>
         <w:jc w:val="center"/>
       </w:pPr>
       <w:r>
         <w:rPr>
           <w:b w:val="0"/>
-          <w:sz w:val="22"/>
-        </w:rPr>
-        <w:t>Josefina Aledo Velasquez - i202215311</w:t>
-      </w:r>
-    </w:p>
-    <w:p>
-      <w:pPr>
-        <w:spacing w:after="280"/>
-        <w:jc w:val="center"/>
-      </w:pPr>
-      <w:r>
-        <w:rPr>
-          <w:b w:val="0"/>
+          <w:i w:val="0"/>
           <w:sz w:val="22"/>
         </w:rPr>
       </w:r>
@@ -223,22 +246,10 @@
       <w:r>
         <w:rPr>
           <w:b w:val="0"/>
+          <w:i w:val="0"/>
           <w:sz w:val="22"/>
         </w:rPr>
-        <w:t>Lima, Perú</w:t>
-      </w:r>
-    </w:p>
-    <w:p>
-      <w:pPr>
-        <w:spacing w:after="0"/>
-        <w:jc w:val="center"/>
-      </w:pPr>
-      <w:r>
-        <w:rPr>
-          <w:b w:val="0"/>
-          <w:sz w:val="22"/>
-        </w:rPr>
-        <w:t>2026</w:t>
+        <w:t>Cibertec Lima Centro, Junio del 2026</w:t>
       </w:r>
     </w:p>
     <w:p>
@@ -254,6 +265,7 @@
       <w:r>
         <w:rPr>
           <w:b/>
+          <w:i w:val="0"/>
           <w:color w:val="6F4E37"/>
           <w:sz w:val="32"/>
         </w:rPr>
@@ -265,7 +277,7 @@
         <w:fldChar w:fldCharType="begin"/>
         <w:instrText xml:space="preserve">TOC \o "1-2" \h \z \u</w:instrText>
         <w:fldChar w:fldCharType="separate"/>
-        <w:t>Para ver el índice: clic derecho sobre esta línea y elija "Actualizar campos".</w:t>
+        <w:t>Para ver el índice: clic derecho aquí y elija "Actualizar campos".</w:t>
         <w:fldChar w:fldCharType="end"/>
       </w:r>
     </w:p>
@@ -279,38 +291,256 @@
         <w:pStyle w:val="Heading1"/>
       </w:pPr>
       <w:r>
-        <w:t>1. INTRODUCCIÓN Y DESCRIPCIÓN DEL CASO DE NEGOCIO</w:t>
+        <w:t>1. RESUMEN</w:t>
       </w:r>
     </w:p>
     <w:p>
       <w:r>
-        <w:t>El presente proyecto describe el desarrollo e implementación de un sistema de información web para Café Origen S.A.C., una empresa dedicada al café de especialidad. El sistema es un panel de administración que centraliza el mantenimiento del catálogo de productos —organizados por categoría y abastecidos por proveedores— y la gestión del personal del local, con control de acceso por roles y reportes en formato PDF.</w:t>
+        <w:t>El presente proyecto consiste en el desarrollo e implementación de un sistema de información web para Café Origen S.A.C., empresa dedicada al café de especialidad. La solución es un panel de administración que centraliza el mantenimiento del catálogo de productos —organizados por categoría y abastecidos por proveedores— y la gestión del personal del local. El sistema incorpora control de acceso mediante roles, consultas de búsqueda, baja lógica de registros y la generación de reportes en formato PDF, mejorando el orden de la información y la eficiencia administrativa de la empresa.</w:t>
       </w:r>
     </w:p>
     <w:p>
       <w:pPr>
-        <w:pStyle w:val="Heading2"/>
+        <w:pStyle w:val="Heading1"/>
       </w:pPr>
       <w:r>
-        <w:t>1.1. Identificación del Problema Operativo</w:t>
+        <w:t>2. INTRODUCCIÓN</w:t>
       </w:r>
     </w:p>
     <w:p>
       <w:r>
-        <w:t>Anteriormente, Café Origen gestionaba el catálogo de productos y la información del personal mediante hojas de cálculo y registros manuales. Esto ocasionaba inconsistencias en el inventario, dificultad para mantener actualizada la relación de proveedores y categorías, y la imposibilidad de generar reportes confiables de manera rápida.</w:t>
+        <w:t>Actualmente, las empresas requieren soluciones tecnológicas que les permitan optimizar sus procesos internos y ordenar su información. En este contexto, Café Origen S.A.C., empresa especializada en café de especialidad, presentaba dificultades para administrar su catálogo de productos y la información de su personal, ya que lo hacía mediante hojas de cálculo y registros manuales.</w:t>
+      </w:r>
+    </w:p>
+    <w:p>
+      <w:r>
+        <w:t>El diagnóstico realizado permitió identificar problemas relacionados con inconsistencias en el inventario, dificultad para mantener actualizadas las categorías y los proveedores, y demoras en la obtención de reportes. Frente a esta situación, se planteó el desarrollo de un sistema web que centralice la información y agilice la gestión administrativa de la empresa.</w:t>
+      </w:r>
+    </w:p>
+    <w:p>
+      <w:r>
+        <w:t>El proyecto tiene como finalidad mejorar el control del catálogo y del personal, así como proporcionar información confiable para la toma de decisiones, generando un impacto positivo en la eficiencia operativa de la empresa.</w:t>
       </w:r>
     </w:p>
     <w:p>
       <w:pPr>
-        <w:pStyle w:val="Heading2"/>
+        <w:pStyle w:val="Heading1"/>
       </w:pPr>
       <w:r>
-        <w:t>1.2. Objetivos del Proyecto</w:t>
+        <w:t>3. DIAGNÓSTICO (ANÁLISIS SEPTE)</w:t>
       </w:r>
     </w:p>
     <w:p>
       <w:r>
-        <w:t>Los objetivos se plantean siguiendo los criterios SMART (específicos, medibles, alcanzables, relevantes y con un plazo definido):</w:t>
+        <w:t>Con el propósito de identificar los factores externos que influyen en las operaciones de Café Origen S.A.C., se realizó un análisis SEPTE considerando los factores Social, Económico, Político, Tecnológico y Ecológico.</w:t>
+      </w:r>
+    </w:p>
+    <w:p>
+      <w:r>
+        <w:rPr>
+          <w:b/>
+        </w:rPr>
+        <w:t>Factor Social</w:t>
+      </w:r>
+    </w:p>
+    <w:p>
+      <w:r>
+        <w:t>El consumo de café de especialidad ha crecido de forma sostenida y los clientes valoran cada vez más la variedad, la calidad y la trazabilidad de los productos. Esto exige a la empresa mantener un catálogo ordenado y actualizado para responder a dicha demanda.</w:t>
+      </w:r>
+    </w:p>
+    <w:p>
+      <w:r>
+        <w:rPr>
+          <w:b/>
+        </w:rPr>
+        <w:t>Evidencia:</w:t>
+      </w:r>
+    </w:p>
+    <w:p>
+      <w:pPr>
+        <w:pStyle w:val="ListBullet"/>
+      </w:pPr>
+      <w:r>
+        <w:t>Crecimiento del consumo de café de especialidad en zonas urbanas.</w:t>
+      </w:r>
+    </w:p>
+    <w:p>
+      <w:pPr>
+        <w:pStyle w:val="ListBullet"/>
+      </w:pPr>
+      <w:r>
+        <w:t>Mayor exigencia de los clientes por una atención rápida y ordenada.</w:t>
+      </w:r>
+    </w:p>
+    <w:p>
+      <w:r>
+        <w:rPr>
+          <w:b/>
+        </w:rPr>
+        <w:t>Factor Económico</w:t>
+      </w:r>
+    </w:p>
+    <w:p>
+      <w:r>
+        <w:t>La situación económica obliga a las empresas a optimizar recursos y reducir costos operativos. Los errores en la gestión manual del inventario y del personal generan pérdidas económicas y duplicidad de registros. Un sistema automatizado mejora la eficiencia y reduce esos errores.</w:t>
+      </w:r>
+    </w:p>
+    <w:p>
+      <w:r>
+        <w:rPr>
+          <w:b/>
+        </w:rPr>
+        <w:t>Evidencia:</w:t>
+      </w:r>
+    </w:p>
+    <w:p>
+      <w:pPr>
+        <w:pStyle w:val="ListBullet"/>
+      </w:pPr>
+      <w:r>
+        <w:t>Necesidad de reducir costos administrativos mediante procesos digitales.</w:t>
+      </w:r>
+    </w:p>
+    <w:p>
+      <w:pPr>
+        <w:pStyle w:val="ListBullet"/>
+      </w:pPr>
+      <w:r>
+        <w:t>Un mejor control del inventario reduce las mermas y mejora la rentabilidad.</w:t>
+      </w:r>
+    </w:p>
+    <w:p>
+      <w:r>
+        <w:rPr>
+          <w:b/>
+        </w:rPr>
+        <w:t>Factor Político / Legal</w:t>
+      </w:r>
+    </w:p>
+    <w:p>
+      <w:r>
+        <w:t>Las empresas deben cumplir las normativas vigentes relacionadas con la protección de datos personales y la formalización laboral. El registro ordenado de los empleados y el control de accesos contribuyen a dicho cumplimiento.</w:t>
+      </w:r>
+    </w:p>
+    <w:p>
+      <w:r>
+        <w:rPr>
+          <w:b/>
+        </w:rPr>
+        <w:t>Evidencia:</w:t>
+      </w:r>
+    </w:p>
+    <w:p>
+      <w:pPr>
+        <w:pStyle w:val="ListBullet"/>
+      </w:pPr>
+      <w:r>
+        <w:t>Obligación de llevar de forma ordenada la planilla y los datos del personal.</w:t>
+      </w:r>
+    </w:p>
+    <w:p>
+      <w:pPr>
+        <w:pStyle w:val="ListBullet"/>
+      </w:pPr>
+      <w:r>
+        <w:t>Normativa de protección de datos personales que exige un manejo seguro de la información.</w:t>
+      </w:r>
+    </w:p>
+    <w:p>
+      <w:r>
+        <w:rPr>
+          <w:b/>
+        </w:rPr>
+        <w:t>Factor Tecnológico</w:t>
+      </w:r>
+    </w:p>
+    <w:p>
+      <w:r>
+        <w:t>La transformación digital ha impulsado el uso de sistemas web para optimizar la gestión empresarial. El desarrollo de una aplicación con Spring Boot y MySQL permite automatizar los mantenimientos, gestionar la información de forma segura y generar reportes para la toma de decisiones.</w:t>
+      </w:r>
+    </w:p>
+    <w:p>
+      <w:r>
+        <w:rPr>
+          <w:b/>
+        </w:rPr>
+        <w:t>Evidencia:</w:t>
+      </w:r>
+    </w:p>
+    <w:p>
+      <w:pPr>
+        <w:pStyle w:val="ListBullet"/>
+      </w:pPr>
+      <w:r>
+        <w:t>Incremento de la adopción de soluciones web y sistemas de gestión empresarial.</w:t>
+      </w:r>
+    </w:p>
+    <w:p>
+      <w:pPr>
+        <w:pStyle w:val="ListBullet"/>
+      </w:pPr>
+      <w:r>
+        <w:t>Uso creciente de frameworks como Spring Boot para el desarrollo de aplicaciones.</w:t>
+      </w:r>
+    </w:p>
+    <w:p>
+      <w:r>
+        <w:rPr>
+          <w:b/>
+        </w:rPr>
+        <w:t>Factor Ecológico</w:t>
+      </w:r>
+    </w:p>
+    <w:p>
+      <w:r>
+        <w:t>La digitalización de la información y de los reportes contribuye a la reducción del uso de papel. La automatización de procesos permite una gestión más eficiente de los recursos y disminuye el desperdicio generado por errores administrativos.</w:t>
+      </w:r>
+    </w:p>
+    <w:p>
+      <w:r>
+        <w:rPr>
+          <w:b/>
+        </w:rPr>
+        <w:t>Evidencia:</w:t>
+      </w:r>
+    </w:p>
+    <w:p>
+      <w:pPr>
+        <w:pStyle w:val="ListBullet"/>
+      </w:pPr>
+      <w:r>
+        <w:t>Tendencia empresarial hacia la reducción del consumo de papel.</w:t>
+      </w:r>
+    </w:p>
+    <w:p>
+      <w:pPr>
+        <w:pStyle w:val="ListBullet"/>
+      </w:pPr>
+      <w:r>
+        <w:t>Generación de reportes en formato PDF en lugar de documentos impresos.</w:t>
+      </w:r>
+    </w:p>
+    <w:p>
+      <w:pPr>
+        <w:pStyle w:val="Heading1"/>
+      </w:pPr>
+      <w:r>
+        <w:t>4. OBJETIVOS DEL PROYECTO</w:t>
+      </w:r>
+    </w:p>
+    <w:p>
+      <w:r>
+        <w:t>Objetivo General:</w:t>
+      </w:r>
+    </w:p>
+    <w:p>
+      <w:r>
+        <w:t>Desarrollar e implementar un sistema web de administración para Café Origen S.A.C. que centralice el mantenimiento del catálogo de productos (con sus categorías y proveedores) y la gestión del personal, optimizando los procesos administrativos de la empresa.</w:t>
+      </w:r>
+    </w:p>
+    <w:p>
+      <w:r>
+        <w:t>Objetivos Específicos (formulados bajo criterios SMART):</w:t>
       </w:r>
     </w:p>
     <w:p>
@@ -326,7 +556,7 @@
         <w:pStyle w:val="ListBullet"/>
       </w:pPr>
       <w:r>
-        <w:t>Reducir el tiempo de búsqueda de información mediante dos consultas (productos y empleados por nombre) que devuelvan los resultados de forma inmediata.</w:t>
+        <w:t>Implementar dos consultas de búsqueda (productos y empleados por nombre) que devuelvan los resultados de forma inmediata, reduciendo el tiempo de búsqueda de información.</w:t>
       </w:r>
     </w:p>
     <w:p>
@@ -347,15 +577,23 @@
     </w:p>
     <w:p>
       <w:pPr>
-        <w:pStyle w:val="Heading2"/>
+        <w:pStyle w:val="Heading1"/>
       </w:pPr>
       <w:r>
-        <w:t>1.3. Diagnóstico (Análisis SEPTE)</w:t>
+        <w:t>5. JUSTIFICACIÓN DEL PROYECTO</w:t>
       </w:r>
     </w:p>
     <w:p>
       <w:r>
-        <w:t>Se analiza el entorno del negocio desde los cinco factores del análisis SEPTE:</w:t>
+        <w:t>El desarrollo del sistema web para Café Origen S.A.C. surge de la necesidad de ordenar y centralizar la gestión del catálogo de productos y del personal, que antes se realizaba mediante herramientas independientes que ocasionaban errores y pérdida de tiempo. La implementación de esta solución permite centralizar la información, automatizar los mantenimientos, agilizar las consultas y generar reportes confiables para la toma de decisiones.</w:t>
+      </w:r>
+    </w:p>
+    <w:p>
+      <w:r>
+        <w:rPr>
+          <w:b/>
+        </w:rPr>
+        <w:t>Beneficiarios Directos:</w:t>
       </w:r>
     </w:p>
     <w:p>
@@ -363,13 +601,7 @@
         <w:pStyle w:val="ListBullet"/>
       </w:pPr>
       <w:r>
-        <w:rPr>
-          <w:b/>
-        </w:rPr>
-        <w:t xml:space="preserve">Social: </w:t>
-      </w:r>
-      <w:r>
-        <w:t>El consumo de café de especialidad ha crecido y los clientes valoran la variedad y la calidad. Un catálogo ordenado permite responder mejor a esa demanda.</w:t>
+        <w:t>Administradores del sistema.</w:t>
       </w:r>
     </w:p>
     <w:p>
@@ -377,13 +609,7 @@
         <w:pStyle w:val="ListBullet"/>
       </w:pPr>
       <w:r>
-        <w:rPr>
-          <w:b/>
-        </w:rPr>
-        <w:t xml:space="preserve">Económico: </w:t>
-      </w:r>
-      <w:r>
-        <w:t>Un buen control de inventario, categorías y proveedores reduce las pérdidas por desabastecimiento o productos vencidos y mejora la rentabilidad del negocio.</w:t>
+        <w:t>Recepcionistas y personal administrativo encargado de la gestión.</w:t>
       </w:r>
     </w:p>
     <w:p>
@@ -391,13 +617,15 @@
         <w:pStyle w:val="ListBullet"/>
       </w:pPr>
       <w:r>
+        <w:t>Personal responsable del catálogo y del control de inventario.</w:t>
+      </w:r>
+    </w:p>
+    <w:p>
+      <w:r>
         <w:rPr>
           <w:b/>
         </w:rPr>
-        <w:t xml:space="preserve">Político / Legal: </w:t>
-      </w:r>
-      <w:r>
-        <w:t>La empresa debe cumplir las normas laborales y de formalización. El registro ordenado de los empleados y sus datos facilita dicho cumplimiento.</w:t>
+        <w:t>Beneficiarios Indirectos:</w:t>
       </w:r>
     </w:p>
     <w:p>
@@ -405,13 +633,7 @@
         <w:pStyle w:val="ListBullet"/>
       </w:pPr>
       <w:r>
-        <w:rPr>
-          <w:b/>
-        </w:rPr>
-        <w:t xml:space="preserve">Tecnológico: </w:t>
-      </w:r>
-      <w:r>
-        <w:t>La digitalización mediante una aplicación web (Spring Boot y MySQL) reemplaza las hojas de cálculo y los procesos manuales, agilizando la gestión administrativa.</w:t>
+        <w:t>La empresa Café Origen S.A.C.</w:t>
       </w:r>
     </w:p>
     <w:p>
@@ -419,26 +641,15 @@
         <w:pStyle w:val="ListBullet"/>
       </w:pPr>
       <w:r>
-        <w:rPr>
-          <w:b/>
-        </w:rPr>
-        <w:t xml:space="preserve">Ecológico: </w:t>
-      </w:r>
-      <w:r>
-        <w:t>Al digitalizar los reportes y registros se reduce el uso de papel, y la gestión de proveedores permite priorizar insumos de origen sostenible.</w:t>
+        <w:t>Los proveedores, al mantener una relación más ordenada.</w:t>
       </w:r>
     </w:p>
     <w:p>
       <w:pPr>
-        <w:pStyle w:val="Heading2"/>
+        <w:pStyle w:val="ListBullet"/>
       </w:pPr>
       <w:r>
-        <w:t>1.4. Justificación del Proyecto</w:t>
-      </w:r>
-    </w:p>
-    <w:p>
-      <w:r>
-        <w:t>El proyecto se justifica porque centraliza y ordena la gestión administrativa de Café Origen S.A.C., que antes dependía de hojas de cálculo dispersas. Su principal aporte es reducir los errores de inventario y de registro de personal, agilizar la consulta de información y permitir reportes confiables para la toma de decisiones. Los beneficiarios directos son: la empresa (mejor control de su catálogo, proveedores y planilla), el personal administrativo y los recepcionistas (que realizan su trabajo de forma más rápida y ordenada) y, de manera indirecta, los clientes, que reciben una atención más eficiente.</w:t>
+        <w:t>Los clientes, que reciben una atención más eficiente.</w:t>
       </w:r>
     </w:p>
     <w:p>
@@ -446,12 +657,94 @@
         <w:pStyle w:val="Heading1"/>
       </w:pPr>
       <w:r>
-        <w:t>2. DISEÑO DE LA BASE DE DATOS Y DICCIONARIO DE DATOS</w:t>
+        <w:t>6. DEFINICIÓN Y ALCANCE DEL PROYECTO</w:t>
       </w:r>
     </w:p>
     <w:p>
       <w:r>
-        <w:t>A continuación se documentan el propósito, las columnas y los tipos de datos de las 6 tablas normalizadas de la base de datos relacional db_cafeorigen.</w:t>
+        <w:t>El proyecto consiste en el desarrollo de una aplicación web, construida con Spring Boot, Thymeleaf y MySQL bajo el patrón de arquitectura MVC, que administra el catálogo de productos y el personal de la empresa. Incorpora autenticación y autorización basadas en roles de usuario para garantizar la seguridad de la información.</w:t>
+      </w:r>
+    </w:p>
+    <w:p>
+      <w:r>
+        <w:t>Alcance del proyecto:</w:t>
+      </w:r>
+    </w:p>
+    <w:p>
+      <w:pPr>
+        <w:pStyle w:val="ListBullet"/>
+      </w:pPr>
+      <w:r>
+        <w:t>Autenticación de usuarios y control de acceso por roles.</w:t>
+      </w:r>
+    </w:p>
+    <w:p>
+      <w:pPr>
+        <w:pStyle w:val="ListBullet"/>
+      </w:pPr>
+      <w:r>
+        <w:t>Mantenimiento de productos (asociados a una categoría y un proveedor).</w:t>
+      </w:r>
+    </w:p>
+    <w:p>
+      <w:pPr>
+        <w:pStyle w:val="ListBullet"/>
+      </w:pPr>
+      <w:r>
+        <w:t>Mantenimiento de categorías.</w:t>
+      </w:r>
+    </w:p>
+    <w:p>
+      <w:pPr>
+        <w:pStyle w:val="ListBullet"/>
+      </w:pPr>
+      <w:r>
+        <w:t>Mantenimiento de proveedores.</w:t>
+      </w:r>
+    </w:p>
+    <w:p>
+      <w:pPr>
+        <w:pStyle w:val="ListBullet"/>
+      </w:pPr>
+      <w:r>
+        <w:t>Mantenimiento de empleados y sus credenciales de acceso.</w:t>
+      </w:r>
+    </w:p>
+    <w:p>
+      <w:pPr>
+        <w:pStyle w:val="ListBullet"/>
+      </w:pPr>
+      <w:r>
+        <w:t>Consultas de búsqueda de productos y empleados.</w:t>
+      </w:r>
+    </w:p>
+    <w:p>
+      <w:pPr>
+        <w:pStyle w:val="ListBullet"/>
+      </w:pPr>
+      <w:r>
+        <w:t>Baja lógica de los registros (campo estado).</w:t>
+      </w:r>
+    </w:p>
+    <w:p>
+      <w:pPr>
+        <w:pStyle w:val="ListBullet"/>
+      </w:pPr>
+      <w:r>
+        <w:t>Generación de dos reportes en formato PDF mediante JasperReports.</w:t>
+      </w:r>
+    </w:p>
+    <w:p>
+      <w:pPr>
+        <w:pStyle w:val="Heading1"/>
+      </w:pPr>
+      <w:r>
+        <w:t>7. DISEÑO DE LA BASE DE DATOS Y DICCIONARIO DE DATOS</w:t>
+      </w:r>
+    </w:p>
+    <w:p>
+      <w:r>
+        <w:t>La base de datos relacional db_cafeorigen está compuesta por 6 tablas normalizadas.</w:t>
       </w:r>
     </w:p>
     <w:p>
@@ -2332,12 +2625,7 @@
         <w:pStyle w:val="Heading1"/>
       </w:pPr>
       <w:r>
-        <w:t>3. CASOS DE USO Y DESCRIPCIÓN DE FUNCIONALIDADES</w:t>
-      </w:r>
-    </w:p>
-    <w:p>
-      <w:r>
-        <w:t>El sistema expone las siguientes funciones según el rol del usuario autenticado en la sesión.</w:t>
+        <w:t>8. CASOS DE USO Y DESCRIPCIÓN DE FUNCIONALIDADES</w:t>
       </w:r>
     </w:p>
     <w:p>
@@ -2350,7 +2638,7 @@
     </w:p>
     <w:p>
       <w:r>
-        <w:t>Valida las credenciales contra la tabla 'usuario', verificando que la cuenta esté activa (estado = 1). Carga al usuario en la sesión HTTP y lo deriva al panel principal; el logout invalida la sesión.</w:t>
+        <w:t>Valida las credenciales contra la tabla 'usuario' verificando que la cuenta esté activa, carga al usuario en la sesión y lo deriva al panel principal.</w:t>
       </w:r>
     </w:p>
     <w:p>
@@ -2363,7 +2651,7 @@
     </w:p>
     <w:p>
       <w:r>
-        <w:t>Registra, modifica y da de baja productos en una sola pantalla (formulario + listado). Cada producto se asocia a una categoría y a un proveedor mediante listas desplegables.</w:t>
+        <w:t>Registra, modifica y da de baja productos en una sola pantalla; cada producto se asocia a una categoría y un proveedor mediante listas desplegables.</w:t>
       </w:r>
     </w:p>
     <w:p>
@@ -2376,7 +2664,7 @@
     </w:p>
     <w:p>
       <w:r>
-        <w:t>Permite administrar las categorías con las que se clasifican los productos, en una pantalla de registro y listado.</w:t>
+        <w:t>Administra las categorías con las que se clasifican los productos.</w:t>
       </w:r>
     </w:p>
     <w:p>
@@ -2389,7 +2677,7 @@
     </w:p>
     <w:p>
       <w:r>
-        <w:t>Permite administrar las empresas proveedoras (razón social, teléfono y correo) que abastecen el catálogo.</w:t>
+        <w:t>Administra las empresas proveedoras que abastecen el catálogo.</w:t>
       </w:r>
     </w:p>
     <w:p>
@@ -2402,7 +2690,7 @@
     </w:p>
     <w:p>
       <w:r>
-        <w:t>Mantiene la planilla de colaboradores y sus credenciales de acceso. Cada empleado se vincula a un usuario y este a un rol. La sección se restringe al rol Administrador.</w:t>
+        <w:t>Mantiene la planilla y las credenciales del personal; cada empleado se vincula a un usuario y este a un rol.</w:t>
       </w:r>
     </w:p>
     <w:p>
@@ -2415,7 +2703,7 @@
     </w:p>
     <w:p>
       <w:r>
-        <w:t>Permite buscar productos y empleados por su nombre. Cada consulta filtra el listado mostrando solo los registros activos que coinciden con el texto ingresado.</w:t>
+        <w:t>Permite buscar productos y empleados por su nombre, filtrando solo los registros activos.</w:t>
       </w:r>
     </w:p>
     <w:p>
@@ -2428,7 +2716,7 @@
     </w:p>
     <w:p>
       <w:r>
-        <w:t>Las eliminaciones cambian el campo 'estado' a 0 en lugar de borrar el registro. Los listados muestran únicamente los activos (estado = 1), conservando el histórico.</w:t>
+        <w:t>Las eliminaciones cambian el campo 'estado' a 0; los listados muestran solo los activos.</w:t>
       </w:r>
     </w:p>
     <w:p>
@@ -2441,7 +2729,7 @@
     </w:p>
     <w:p>
       <w:r>
-        <w:t>Genera dos reportes: el catálogo de productos (con su categoría y proveedor) y la planilla de empleados (con su cargo y rol). Se cargan precompilados (.jasper) y se exportan a PDF.</w:t>
+        <w:t>Genera el reporte del catálogo de productos y la planilla de empleados, cargados precompilados (.jasper).</w:t>
       </w:r>
     </w:p>
     <w:p>
@@ -2454,7 +2742,7 @@
     </w:p>
     <w:p>
       <w:r>
-        <w:t>El registro de un empleado crea de forma atómica el usuario y el empleado dentro de una misma transacción (@Transactional): si algo falla, no se guarda ninguno de los dos.</w:t>
+        <w:t>Crea de forma atómica el usuario y el empleado en una misma transacción: si algo falla, no se guarda ninguno.</w:t>
       </w:r>
     </w:p>
     <w:p>
@@ -2467,7 +2755,7 @@
     </w:p>
     <w:p>
       <w:r>
-        <w:t>Documenta y permite probar los endpoints de los controladores desde /swagger-ui/index.html.</w:t>
+        <w:t>Documenta y prueba los endpoints desde /swagger-ui/index.html.</w:t>
       </w:r>
     </w:p>
     <w:p>
@@ -2475,12 +2763,12 @@
         <w:pStyle w:val="Heading1"/>
       </w:pPr>
       <w:r>
-        <w:t>4. ARQUITECTURA LÓGICA Y DESARROLLO MULTICAPA</w:t>
+        <w:t>9. ARQUITECTURA LÓGICA Y DESARROLLO MULTICAPA</w:t>
       </w:r>
     </w:p>
     <w:p>
       <w:r>
-        <w:t>El proyecto implementa una arquitectura limpia y organizada en capas:</w:t>
+        <w:t>El proyecto implementa el patrón MVC organizado en capas:</w:t>
       </w:r>
     </w:p>
     <w:p>
@@ -2491,7 +2779,7 @@
         <w:t xml:space="preserve">Capa Modelo (Entities): </w:t>
       </w:r>
       <w:r>
-        <w:t>Clases Java anotadas con JPA/Jakarta Persistence (Producto, Categoria, Proveedor, Empleado, Usuario, Rol) que mapean las tablas de MySQL. Las relaciones se resuelven con la llave foránea (ej. 'idCategoria') y un objeto de solo lectura asociado ('objCategoria') para mostrar su descripción.</w:t>
+        <w:t>Clases Java con JPA (Producto, Categoria, Proveedor, Empleado, Usuario, Rol) que mapean las tablas. Las relaciones usan la llave foránea (ej. 'idCategoria') y un objeto de solo lectura ('objCategoria').</w:t>
       </w:r>
     </w:p>
     <w:p>
@@ -2502,7 +2790,7 @@
         <w:t xml:space="preserve">Capa Repositorio (DAOs): </w:t>
       </w:r>
       <w:r>
-        <w:t>Interfaces que extienden 'JpaRepository' de Spring Data JPA. Proveen el CRUD y métodos personalizados como 'findByEmailAndPassword' o 'findByEstadoAndNombreContaining' usados en las consultas.</w:t>
+        <w:t>Interfaces que extienden 'JpaRepository' con el CRUD y métodos personalizados como 'findByEmailAndPassword' y 'findByEstadoAndNombreContaining' (usados en las consultas).</w:t>
       </w:r>
     </w:p>
     <w:p>
@@ -2513,7 +2801,7 @@
         <w:t xml:space="preserve">Capa Controlador (Controllers): </w:t>
       </w:r>
       <w:r>
-        <w:t>Maneja las peticiones HTTP (GET, POST) de cada mantenimiento (productos, categorías, proveedores y empleados), valida la sesión y los roles, y asocia los datos a las vistas.</w:t>
+        <w:t>Maneja las peticiones HTTP de cada mantenimiento, valida la sesión y los roles y envía los datos a las vistas.</w:t>
       </w:r>
     </w:p>
     <w:p>
@@ -2524,7 +2812,7 @@
         <w:t xml:space="preserve">Capa Vista (Templates): </w:t>
       </w:r>
       <w:r>
-        <w:t>Páginas HTML5 con atributos 'th:text', 'th:each' y 'th:if' de Thymeleaf, estilizadas con Bootstrap 5 y modularizadas con fragmentos ('fragments/navegacion.html').</w:t>
+        <w:t>Páginas HTML con Thymeleaf (th:text, th:each, th:if), estilizadas con Bootstrap 5 y modularizadas con fragmentos.</w:t>
       </w:r>
     </w:p>
     <w:p>
@@ -2532,12 +2820,7 @@
         <w:pStyle w:val="Heading1"/>
       </w:pPr>
       <w:r>
-        <w:t>5. GUÍA DE INSTALACIÓN Y MANUAL DE EJECUCIÓN</w:t>
-      </w:r>
-    </w:p>
-    <w:p>
-      <w:r>
-        <w:t>Sigue estos pasos para desplegar y correr el aplicativo de forma local:</w:t>
+        <w:t>10. GUÍA DE INSTALACIÓN Y MANUAL DE EJECUCIÓN</w:t>
       </w:r>
     </w:p>
     <w:p>
@@ -2545,7 +2828,7 @@
         <w:pStyle w:val="ListNumber"/>
       </w:pPr>
       <w:r>
-        <w:t>Restaurar la Base de Datos: abre MySQL Workbench, carga el script 'database/script.sql' y ejecútalo por completo. Esto crea la base de datos 'db_cafeorigen', sus tablas y los datos de prueba.</w:t>
+        <w:t>Restaurar la Base de Datos: ejecutar por completo el script 'database/script.sql' en MySQL para crear 'db_cafeorigen', sus tablas y los datos de prueba.</w:t>
       </w:r>
     </w:p>
     <w:p>
@@ -2553,7 +2836,7 @@
         <w:pStyle w:val="ListNumber"/>
       </w:pPr>
       <w:r>
-        <w:t>Configurar Propiedades: abre 'src/main/resources/application.properties' y verifica la contraseña de tu conexión a MySQL. El servidor usa el puerto 8090.</w:t>
+        <w:t>Configurar 'application.properties': verificar la contraseña de MySQL. El servidor usa el puerto 8090.</w:t>
       </w:r>
     </w:p>
     <w:p>
@@ -2561,7 +2844,7 @@
         <w:pStyle w:val="ListNumber"/>
       </w:pPr>
       <w:r>
-        <w:t>Importar Proyecto Maven: en Eclipse o Spring Tool Suite, usa 'File' -&gt; 'Import' -&gt; 'Existing Maven Projects', elige la carpeta raíz y pulsa 'Finish'.</w:t>
+        <w:t>Importar el proyecto Maven en Eclipse o Spring Tool Suite ('Existing Maven Projects').</w:t>
       </w:r>
     </w:p>
     <w:p>
@@ -2569,7 +2852,7 @@
         <w:pStyle w:val="ListNumber"/>
       </w:pPr>
       <w:r>
-        <w:t>Ejecutar: clic derecho en el proyecto -&gt; 'Run As' -&gt; 'Spring Boot App' (o ejecuta 'Lp2Application.java').</w:t>
+        <w:t>Ejecutar la clase 'Lp2Application.java' como Spring Boot App.</w:t>
       </w:r>
     </w:p>
     <w:p>
@@ -2577,7 +2860,7 @@
         <w:pStyle w:val="ListNumber"/>
       </w:pPr>
       <w:r>
-        <w:t>Acceder: abre 'http://localhost:8090' e inicia sesión con admin@cafeorigen.pe / admin123. La API está en 'http://localhost:8090/swagger-ui/index.html'.</w:t>
+        <w:t>Acceder a 'http://localhost:8090' e iniciar sesión con admin@cafeorigen.pe / admin123.</w:t>
       </w:r>
     </w:p>
     <w:p>
@@ -2585,7 +2868,7 @@
         <w:pStyle w:val="Heading1"/>
       </w:pPr>
       <w:r>
-        <w:t>6. CONCLUSIONES</w:t>
+        <w:t>11. CONCLUSIONES</w:t>
       </w:r>
     </w:p>
     <w:p>
@@ -2593,7 +2876,7 @@
         <w:pStyle w:val="ListBullet"/>
       </w:pPr>
       <w:r>
-        <w:t>Se implementó un panel de administración funcional que cubre cuatro mantenimientos (productos, categorías, proveedores y empleados) con baja lógica, conservando el histórico de los datos.</w:t>
+        <w:t>Se implementó un panel de administración funcional con cuatro mantenimientos (productos, categorías, proveedores y empleados) que aplican baja lógica, conservando el histórico de los datos.</w:t>
       </w:r>
     </w:p>
     <w:p>
@@ -2601,7 +2884,7 @@
         <w:pStyle w:val="ListBullet"/>
       </w:pPr>
       <w:r>
-        <w:t>Las relaciones entre tablas (producto con categoría y proveedor; empleado con usuario y rol) se resolvieron con JPA, demostrando un modelo de datos normalizado y coherente.</w:t>
+        <w:t>Las relaciones entre tablas (producto con categoría y proveedor; empleado con usuario y rol) se resolvieron con JPA, demostrando un modelo de datos normalizado.</w:t>
       </w:r>
     </w:p>
     <w:p>
@@ -2617,7 +2900,866 @@
         <w:pStyle w:val="ListBullet"/>
       </w:pPr>
       <w:r>
-        <w:t>La operación transaccional en el alta de empleados garantiza que el usuario y el empleado se registren de manera consistente, evitando datos incompletos.</w:t>
+        <w:t>La operación transaccional en el alta de empleados garantiza el registro consistente del usuario y el empleado.</w:t>
+      </w:r>
+    </w:p>
+    <w:p>
+      <w:pPr>
+        <w:pStyle w:val="Heading1"/>
+      </w:pPr>
+      <w:r>
+        <w:t>12. RECOMENDACIONES</w:t>
+      </w:r>
+    </w:p>
+    <w:p>
+      <w:pPr>
+        <w:pStyle w:val="ListBullet"/>
+      </w:pPr>
+      <w:r>
+        <w:t>Realizar copias de seguridad periódicas de la base de datos para proteger la información.</w:t>
+      </w:r>
+    </w:p>
+    <w:p>
+      <w:pPr>
+        <w:pStyle w:val="ListBullet"/>
+      </w:pPr>
+      <w:r>
+        <w:t>Considerar, como mejora futura, un módulo de ventas o facturación integrado al catálogo.</w:t>
+      </w:r>
+    </w:p>
+    <w:p>
+      <w:pPr>
+        <w:pStyle w:val="ListBullet"/>
+      </w:pPr>
+      <w:r>
+        <w:t>Capacitar a los usuarios administrativos para asegurar el correcto uso de todas las funcionalidades.</w:t>
+      </w:r>
+    </w:p>
+    <w:p>
+      <w:pPr>
+        <w:pStyle w:val="Heading1"/>
+      </w:pPr>
+      <w:r>
+        <w:t>13. GLOSARIO</w:t>
+      </w:r>
+    </w:p>
+    <w:p>
+      <w:pPr>
+        <w:pStyle w:val="ListBullet"/>
+      </w:pPr>
+      <w:r>
+        <w:rPr>
+          <w:b/>
+        </w:rPr>
+        <w:t xml:space="preserve">Baja lógica: </w:t>
+      </w:r>
+      <w:r>
+        <w:t>Técnica que marca un registro como inactivo (estado = 0) en lugar de eliminarlo físicamente.</w:t>
+      </w:r>
+    </w:p>
+    <w:p>
+      <w:pPr>
+        <w:pStyle w:val="ListBullet"/>
+      </w:pPr>
+      <w:r>
+        <w:rPr>
+          <w:b/>
+        </w:rPr>
+        <w:t xml:space="preserve">CRUD: </w:t>
+      </w:r>
+      <w:r>
+        <w:t>Operaciones de Crear, Leer, Actualizar y Eliminar; equivale a un mantenimiento.</w:t>
+      </w:r>
+    </w:p>
+    <w:p>
+      <w:pPr>
+        <w:pStyle w:val="ListBullet"/>
+      </w:pPr>
+      <w:r>
+        <w:rPr>
+          <w:b/>
+        </w:rPr>
+        <w:t xml:space="preserve">JasperReports: </w:t>
+      </w:r>
+      <w:r>
+        <w:t>Herramienta para la generación de reportes y documentos en formato PDF.</w:t>
+      </w:r>
+    </w:p>
+    <w:p>
+      <w:pPr>
+        <w:pStyle w:val="ListBullet"/>
+      </w:pPr>
+      <w:r>
+        <w:rPr>
+          <w:b/>
+        </w:rPr>
+        <w:t xml:space="preserve">JPA: </w:t>
+      </w:r>
+      <w:r>
+        <w:t>Especificación de Java para mapear objetos a tablas de una base de datos relacional.</w:t>
+      </w:r>
+    </w:p>
+    <w:p>
+      <w:pPr>
+        <w:pStyle w:val="ListBullet"/>
+      </w:pPr>
+      <w:r>
+        <w:rPr>
+          <w:b/>
+        </w:rPr>
+        <w:t xml:space="preserve">MVC: </w:t>
+      </w:r>
+      <w:r>
+        <w:t>Patrón de arquitectura de software que separa Modelo, Vista y Controlador.</w:t>
+      </w:r>
+    </w:p>
+    <w:p>
+      <w:pPr>
+        <w:pStyle w:val="ListBullet"/>
+      </w:pPr>
+      <w:r>
+        <w:rPr>
+          <w:b/>
+        </w:rPr>
+        <w:t xml:space="preserve">Transacción: </w:t>
+      </w:r>
+      <w:r>
+        <w:t>Conjunto de operaciones que se ejecutan como una sola unidad: o se completan todas o ninguna.</w:t>
+      </w:r>
+    </w:p>
+    <w:p>
+      <w:pPr>
+        <w:pStyle w:val="ListBullet"/>
+      </w:pPr>
+      <w:r>
+        <w:rPr>
+          <w:b/>
+        </w:rPr>
+        <w:t xml:space="preserve">Stock: </w:t>
+      </w:r>
+      <w:r>
+        <w:t>Cantidad disponible de un producto dentro del inventario.</w:t>
+      </w:r>
+    </w:p>
+    <w:p>
+      <w:pPr>
+        <w:pStyle w:val="Heading1"/>
+      </w:pPr>
+      <w:r>
+        <w:t>14. BIBLIOGRAFÍA</w:t>
+      </w:r>
+    </w:p>
+    <w:p>
+      <w:pPr>
+        <w:pStyle w:val="ListBullet"/>
+      </w:pPr>
+      <w:r>
+        <w:t>Laudon, K. C., &amp; Laudon, J. P. (2022). Sistemas de información gerencial (17.ª ed.). Pearson Educación.</w:t>
+      </w:r>
+    </w:p>
+    <w:p>
+      <w:pPr>
+        <w:pStyle w:val="ListBullet"/>
+      </w:pPr>
+      <w:r>
+        <w:t>Pressman, R. S., &amp; Maxim, B. R. (2020). Ingeniería de software: Un enfoque práctico (9.ª ed.). McGraw-Hill Education.</w:t>
+      </w:r>
+    </w:p>
+    <w:p>
+      <w:pPr>
+        <w:pStyle w:val="ListBullet"/>
+      </w:pPr>
+      <w:r>
+        <w:t>Coronel, C., &amp; Morris, S. (2020). Sistemas de bases de datos: Diseño, implementación y administración (13.ª ed.). Cengage Learning.</w:t>
+      </w:r>
+    </w:p>
+    <w:p>
+      <w:pPr>
+        <w:pStyle w:val="ListBullet"/>
+      </w:pPr>
+      <w:r>
+        <w:t>Elmasri, R., &amp; Navathe, S. B. (2017). Fundamentos de sistemas de bases de datos (7.ª ed.). Pearson Educación.</w:t>
+      </w:r>
+    </w:p>
+    <w:p>
+      <w:pPr>
+        <w:pStyle w:val="ListBullet"/>
+      </w:pPr>
+      <w:r>
+        <w:t>Oracle Corporation. (2025). MySQL Documentation. https://dev.mysql.com/doc/</w:t>
+      </w:r>
+    </w:p>
+    <w:p>
+      <w:pPr>
+        <w:pStyle w:val="ListBullet"/>
+      </w:pPr>
+      <w:r>
+        <w:t>VMware. (2025). Spring Boot Reference Documentation. https://spring.io/projects/spring-boot</w:t>
+      </w:r>
+    </w:p>
+    <w:p>
+      <w:r>
+        <w:br w:type="page"/>
+      </w:r>
+    </w:p>
+    <w:p>
+      <w:pPr>
+        <w:pStyle w:val="Heading1"/>
+      </w:pPr>
+      <w:r>
+        <w:t>15. ANEXOS (CAPTURAS DE PANTALLA)</w:t>
+      </w:r>
+    </w:p>
+    <w:p>
+      <w:r>
+        <w:t>Reemplace cada recuadro por la captura correspondiente tomada al ejecutar el sistema.</w:t>
+      </w:r>
+    </w:p>
+    <w:p>
+      <w:pPr>
+        <w:pStyle w:val="Heading2"/>
+      </w:pPr>
+      <w:r>
+        <w:t>Anexo A. Inicio de Sesión</w:t>
+      </w:r>
+    </w:p>
+    <w:tbl>
+      <w:tblPr>
+        <w:tblStyle w:val="TableGrid"/>
+        <w:tblW w:type="auto" w:w="0"/>
+        <w:jc w:val="center"/>
+        <w:tblLayout w:type="fixed"/>
+        <w:tblLook w:firstColumn="1" w:firstRow="1" w:lastColumn="0" w:lastRow="0" w:noHBand="0" w:noVBand="1" w:val="04A0"/>
+      </w:tblPr>
+      <w:tblGrid>
+        <w:gridCol w:w="9360"/>
+      </w:tblGrid>
+      <w:tr>
+        <w:trPr>
+          <w:trHeight w:val="3600" w:hRule="atLeast"/>
+        </w:trPr>
+        <w:tc>
+          <w:tcPr>
+            <w:tcW w:type="dxa" w:w="9360"/>
+          </w:tcPr>
+          <w:p>
+            <w:pPr>
+              <w:jc w:val="center"/>
+            </w:pPr>
+            <w:r/>
+            <w:r>
+              <w:drawing>
+                <wp:inline xmlns:a="http://schemas.openxmlformats.org/drawingml/2006/main" xmlns:pic="http://schemas.openxmlformats.org/drawingml/2006/picture">
+                  <wp:extent cx="5577840" cy="3486150"/>
+                  <wp:docPr id="2" name="Picture 2"/>
+                  <wp:cNvGraphicFramePr>
+                    <a:graphicFrameLocks noChangeAspect="1"/>
+                  </wp:cNvGraphicFramePr>
+                  <a:graphic>
+                    <a:graphicData uri="http://schemas.openxmlformats.org/drawingml/2006/picture">
+                      <pic:pic>
+                        <pic:nvPicPr>
+                          <pic:cNvPr id="0" name="A_login.png"/>
+                          <pic:cNvPicPr/>
+                        </pic:nvPicPr>
+                        <pic:blipFill>
+                          <a:blip r:embed="rId10"/>
+                          <a:stretch>
+                            <a:fillRect/>
+                          </a:stretch>
+                        </pic:blipFill>
+                        <pic:spPr>
+                          <a:xfrm>
+                            <a:off x="0" y="0"/>
+                            <a:ext cx="5577840" cy="3486150"/>
+                          </a:xfrm>
+                          <a:prstGeom prst="rect"/>
+                        </pic:spPr>
+                      </pic:pic>
+                    </a:graphicData>
+                  </a:graphic>
+                </wp:inline>
+              </w:drawing>
+            </w:r>
+          </w:p>
+        </w:tc>
+      </w:tr>
+    </w:tbl>
+    <w:p>
+      <w:pPr>
+        <w:spacing w:after="120"/>
+      </w:pPr>
+    </w:p>
+    <w:p>
+      <w:pPr>
+        <w:pStyle w:val="Heading2"/>
+      </w:pPr>
+      <w:r>
+        <w:t>Anexo B. Panel Principal</w:t>
+      </w:r>
+    </w:p>
+    <w:tbl>
+      <w:tblPr>
+        <w:tblStyle w:val="TableGrid"/>
+        <w:tblW w:type="auto" w:w="0"/>
+        <w:jc w:val="center"/>
+        <w:tblLayout w:type="fixed"/>
+        <w:tblLook w:firstColumn="1" w:firstRow="1" w:lastColumn="0" w:lastRow="0" w:noHBand="0" w:noVBand="1" w:val="04A0"/>
+      </w:tblPr>
+      <w:tblGrid>
+        <w:gridCol w:w="9360"/>
+      </w:tblGrid>
+      <w:tr>
+        <w:trPr>
+          <w:trHeight w:val="3600" w:hRule="atLeast"/>
+        </w:trPr>
+        <w:tc>
+          <w:tcPr>
+            <w:tcW w:type="dxa" w:w="9360"/>
+          </w:tcPr>
+          <w:p>
+            <w:pPr>
+              <w:jc w:val="center"/>
+            </w:pPr>
+            <w:r/>
+            <w:r>
+              <w:drawing>
+                <wp:inline xmlns:a="http://schemas.openxmlformats.org/drawingml/2006/main" xmlns:pic="http://schemas.openxmlformats.org/drawingml/2006/picture">
+                  <wp:extent cx="5577840" cy="3486150"/>
+                  <wp:docPr id="3" name="Picture 3"/>
+                  <wp:cNvGraphicFramePr>
+                    <a:graphicFrameLocks noChangeAspect="1"/>
+                  </wp:cNvGraphicFramePr>
+                  <a:graphic>
+                    <a:graphicData uri="http://schemas.openxmlformats.org/drawingml/2006/picture">
+                      <pic:pic>
+                        <pic:nvPicPr>
+                          <pic:cNvPr id="0" name="B_dashboard.png"/>
+                          <pic:cNvPicPr/>
+                        </pic:nvPicPr>
+                        <pic:blipFill>
+                          <a:blip r:embed="rId11"/>
+                          <a:stretch>
+                            <a:fillRect/>
+                          </a:stretch>
+                        </pic:blipFill>
+                        <pic:spPr>
+                          <a:xfrm>
+                            <a:off x="0" y="0"/>
+                            <a:ext cx="5577840" cy="3486150"/>
+                          </a:xfrm>
+                          <a:prstGeom prst="rect"/>
+                        </pic:spPr>
+                      </pic:pic>
+                    </a:graphicData>
+                  </a:graphic>
+                </wp:inline>
+              </w:drawing>
+            </w:r>
+          </w:p>
+        </w:tc>
+      </w:tr>
+    </w:tbl>
+    <w:p>
+      <w:pPr>
+        <w:spacing w:after="120"/>
+      </w:pPr>
+    </w:p>
+    <w:p>
+      <w:pPr>
+        <w:pStyle w:val="Heading2"/>
+      </w:pPr>
+      <w:r>
+        <w:t>Anexo C. Mantenimiento de Productos</w:t>
+      </w:r>
+    </w:p>
+    <w:tbl>
+      <w:tblPr>
+        <w:tblStyle w:val="TableGrid"/>
+        <w:tblW w:type="auto" w:w="0"/>
+        <w:jc w:val="center"/>
+        <w:tblLayout w:type="fixed"/>
+        <w:tblLook w:firstColumn="1" w:firstRow="1" w:lastColumn="0" w:lastRow="0" w:noHBand="0" w:noVBand="1" w:val="04A0"/>
+      </w:tblPr>
+      <w:tblGrid>
+        <w:gridCol w:w="9360"/>
+      </w:tblGrid>
+      <w:tr>
+        <w:trPr>
+          <w:trHeight w:val="3600" w:hRule="atLeast"/>
+        </w:trPr>
+        <w:tc>
+          <w:tcPr>
+            <w:tcW w:type="dxa" w:w="9360"/>
+          </w:tcPr>
+          <w:p>
+            <w:pPr>
+              <w:jc w:val="center"/>
+            </w:pPr>
+            <w:r/>
+            <w:r>
+              <w:drawing>
+                <wp:inline xmlns:a="http://schemas.openxmlformats.org/drawingml/2006/main" xmlns:pic="http://schemas.openxmlformats.org/drawingml/2006/picture">
+                  <wp:extent cx="5577840" cy="5136261"/>
+                  <wp:docPr id="4" name="Picture 4"/>
+                  <wp:cNvGraphicFramePr>
+                    <a:graphicFrameLocks noChangeAspect="1"/>
+                  </wp:cNvGraphicFramePr>
+                  <a:graphic>
+                    <a:graphicData uri="http://schemas.openxmlformats.org/drawingml/2006/picture">
+                      <pic:pic>
+                        <pic:nvPicPr>
+                          <pic:cNvPr id="0" name="C_productos.png"/>
+                          <pic:cNvPicPr/>
+                        </pic:nvPicPr>
+                        <pic:blipFill>
+                          <a:blip r:embed="rId12"/>
+                          <a:stretch>
+                            <a:fillRect/>
+                          </a:stretch>
+                        </pic:blipFill>
+                        <pic:spPr>
+                          <a:xfrm>
+                            <a:off x="0" y="0"/>
+                            <a:ext cx="5577840" cy="5136261"/>
+                          </a:xfrm>
+                          <a:prstGeom prst="rect"/>
+                        </pic:spPr>
+                      </pic:pic>
+                    </a:graphicData>
+                  </a:graphic>
+                </wp:inline>
+              </w:drawing>
+            </w:r>
+          </w:p>
+        </w:tc>
+      </w:tr>
+    </w:tbl>
+    <w:p>
+      <w:pPr>
+        <w:spacing w:after="120"/>
+      </w:pPr>
+    </w:p>
+    <w:p>
+      <w:pPr>
+        <w:pStyle w:val="Heading2"/>
+      </w:pPr>
+      <w:r>
+        <w:t>Anexo D. Mantenimiento de Categorías</w:t>
+      </w:r>
+    </w:p>
+    <w:tbl>
+      <w:tblPr>
+        <w:tblStyle w:val="TableGrid"/>
+        <w:tblW w:type="auto" w:w="0"/>
+        <w:jc w:val="center"/>
+        <w:tblLayout w:type="fixed"/>
+        <w:tblLook w:firstColumn="1" w:firstRow="1" w:lastColumn="0" w:lastRow="0" w:noHBand="0" w:noVBand="1" w:val="04A0"/>
+      </w:tblPr>
+      <w:tblGrid>
+        <w:gridCol w:w="9360"/>
+      </w:tblGrid>
+      <w:tr>
+        <w:trPr>
+          <w:trHeight w:val="3600" w:hRule="atLeast"/>
+        </w:trPr>
+        <w:tc>
+          <w:tcPr>
+            <w:tcW w:type="dxa" w:w="9360"/>
+          </w:tcPr>
+          <w:p>
+            <w:pPr>
+              <w:jc w:val="center"/>
+            </w:pPr>
+            <w:r/>
+            <w:r>
+              <w:drawing>
+                <wp:inline xmlns:a="http://schemas.openxmlformats.org/drawingml/2006/main" xmlns:pic="http://schemas.openxmlformats.org/drawingml/2006/picture">
+                  <wp:extent cx="5577840" cy="3486150"/>
+                  <wp:docPr id="5" name="Picture 5"/>
+                  <wp:cNvGraphicFramePr>
+                    <a:graphicFrameLocks noChangeAspect="1"/>
+                  </wp:cNvGraphicFramePr>
+                  <a:graphic>
+                    <a:graphicData uri="http://schemas.openxmlformats.org/drawingml/2006/picture">
+                      <pic:pic>
+                        <pic:nvPicPr>
+                          <pic:cNvPr id="0" name="D_categorias.png"/>
+                          <pic:cNvPicPr/>
+                        </pic:nvPicPr>
+                        <pic:blipFill>
+                          <a:blip r:embed="rId13"/>
+                          <a:stretch>
+                            <a:fillRect/>
+                          </a:stretch>
+                        </pic:blipFill>
+                        <pic:spPr>
+                          <a:xfrm>
+                            <a:off x="0" y="0"/>
+                            <a:ext cx="5577840" cy="3486150"/>
+                          </a:xfrm>
+                          <a:prstGeom prst="rect"/>
+                        </pic:spPr>
+                      </pic:pic>
+                    </a:graphicData>
+                  </a:graphic>
+                </wp:inline>
+              </w:drawing>
+            </w:r>
+          </w:p>
+        </w:tc>
+      </w:tr>
+    </w:tbl>
+    <w:p>
+      <w:pPr>
+        <w:spacing w:after="120"/>
+      </w:pPr>
+    </w:p>
+    <w:p>
+      <w:pPr>
+        <w:pStyle w:val="Heading2"/>
+      </w:pPr>
+      <w:r>
+        <w:t>Anexo E. Mantenimiento de Proveedores</w:t>
+      </w:r>
+    </w:p>
+    <w:tbl>
+      <w:tblPr>
+        <w:tblStyle w:val="TableGrid"/>
+        <w:tblW w:type="auto" w:w="0"/>
+        <w:jc w:val="center"/>
+        <w:tblLayout w:type="fixed"/>
+        <w:tblLook w:firstColumn="1" w:firstRow="1" w:lastColumn="0" w:lastRow="0" w:noHBand="0" w:noVBand="1" w:val="04A0"/>
+      </w:tblPr>
+      <w:tblGrid>
+        <w:gridCol w:w="9360"/>
+      </w:tblGrid>
+      <w:tr>
+        <w:trPr>
+          <w:trHeight w:val="3600" w:hRule="atLeast"/>
+        </w:trPr>
+        <w:tc>
+          <w:tcPr>
+            <w:tcW w:type="dxa" w:w="9360"/>
+          </w:tcPr>
+          <w:p>
+            <w:pPr>
+              <w:jc w:val="center"/>
+            </w:pPr>
+            <w:r/>
+            <w:r>
+              <w:drawing>
+                <wp:inline xmlns:a="http://schemas.openxmlformats.org/drawingml/2006/main" xmlns:pic="http://schemas.openxmlformats.org/drawingml/2006/picture">
+                  <wp:extent cx="5577840" cy="3486150"/>
+                  <wp:docPr id="6" name="Picture 6"/>
+                  <wp:cNvGraphicFramePr>
+                    <a:graphicFrameLocks noChangeAspect="1"/>
+                  </wp:cNvGraphicFramePr>
+                  <a:graphic>
+                    <a:graphicData uri="http://schemas.openxmlformats.org/drawingml/2006/picture">
+                      <pic:pic>
+                        <pic:nvPicPr>
+                          <pic:cNvPr id="0" name="E_proveedores.png"/>
+                          <pic:cNvPicPr/>
+                        </pic:nvPicPr>
+                        <pic:blipFill>
+                          <a:blip r:embed="rId14"/>
+                          <a:stretch>
+                            <a:fillRect/>
+                          </a:stretch>
+                        </pic:blipFill>
+                        <pic:spPr>
+                          <a:xfrm>
+                            <a:off x="0" y="0"/>
+                            <a:ext cx="5577840" cy="3486150"/>
+                          </a:xfrm>
+                          <a:prstGeom prst="rect"/>
+                        </pic:spPr>
+                      </pic:pic>
+                    </a:graphicData>
+                  </a:graphic>
+                </wp:inline>
+              </w:drawing>
+            </w:r>
+          </w:p>
+        </w:tc>
+      </w:tr>
+    </w:tbl>
+    <w:p>
+      <w:pPr>
+        <w:spacing w:after="120"/>
+      </w:pPr>
+    </w:p>
+    <w:p>
+      <w:pPr>
+        <w:pStyle w:val="Heading2"/>
+      </w:pPr>
+      <w:r>
+        <w:t>Anexo F. Mantenimiento de Empleados</w:t>
+      </w:r>
+    </w:p>
+    <w:tbl>
+      <w:tblPr>
+        <w:tblStyle w:val="TableGrid"/>
+        <w:tblW w:type="auto" w:w="0"/>
+        <w:jc w:val="center"/>
+        <w:tblLayout w:type="fixed"/>
+        <w:tblLook w:firstColumn="1" w:firstRow="1" w:lastColumn="0" w:lastRow="0" w:noHBand="0" w:noVBand="1" w:val="04A0"/>
+      </w:tblPr>
+      <w:tblGrid>
+        <w:gridCol w:w="9360"/>
+      </w:tblGrid>
+      <w:tr>
+        <w:trPr>
+          <w:trHeight w:val="3600" w:hRule="atLeast"/>
+        </w:trPr>
+        <w:tc>
+          <w:tcPr>
+            <w:tcW w:type="dxa" w:w="9360"/>
+          </w:tcPr>
+          <w:p>
+            <w:pPr>
+              <w:jc w:val="center"/>
+            </w:pPr>
+            <w:r/>
+            <w:r>
+              <w:drawing>
+                <wp:inline xmlns:a="http://schemas.openxmlformats.org/drawingml/2006/main" xmlns:pic="http://schemas.openxmlformats.org/drawingml/2006/picture">
+                  <wp:extent cx="5577840" cy="3892868"/>
+                  <wp:docPr id="7" name="Picture 7"/>
+                  <wp:cNvGraphicFramePr>
+                    <a:graphicFrameLocks noChangeAspect="1"/>
+                  </wp:cNvGraphicFramePr>
+                  <a:graphic>
+                    <a:graphicData uri="http://schemas.openxmlformats.org/drawingml/2006/picture">
+                      <pic:pic>
+                        <pic:nvPicPr>
+                          <pic:cNvPr id="0" name="F_empleados.png"/>
+                          <pic:cNvPicPr/>
+                        </pic:nvPicPr>
+                        <pic:blipFill>
+                          <a:blip r:embed="rId15"/>
+                          <a:stretch>
+                            <a:fillRect/>
+                          </a:stretch>
+                        </pic:blipFill>
+                        <pic:spPr>
+                          <a:xfrm>
+                            <a:off x="0" y="0"/>
+                            <a:ext cx="5577840" cy="3892868"/>
+                          </a:xfrm>
+                          <a:prstGeom prst="rect"/>
+                        </pic:spPr>
+                      </pic:pic>
+                    </a:graphicData>
+                  </a:graphic>
+                </wp:inline>
+              </w:drawing>
+            </w:r>
+          </w:p>
+        </w:tc>
+      </w:tr>
+    </w:tbl>
+    <w:p>
+      <w:pPr>
+        <w:spacing w:after="120"/>
+      </w:pPr>
+    </w:p>
+    <w:p>
+      <w:pPr>
+        <w:pStyle w:val="Heading2"/>
+      </w:pPr>
+      <w:r>
+        <w:t>Anexo G. Consulta de Búsqueda</w:t>
+      </w:r>
+    </w:p>
+    <w:tbl>
+      <w:tblPr>
+        <w:tblStyle w:val="TableGrid"/>
+        <w:tblW w:type="auto" w:w="0"/>
+        <w:jc w:val="center"/>
+        <w:tblLayout w:type="fixed"/>
+        <w:tblLook w:firstColumn="1" w:firstRow="1" w:lastColumn="0" w:lastRow="0" w:noHBand="0" w:noVBand="1" w:val="04A0"/>
+      </w:tblPr>
+      <w:tblGrid>
+        <w:gridCol w:w="9360"/>
+      </w:tblGrid>
+      <w:tr>
+        <w:trPr>
+          <w:trHeight w:val="3600" w:hRule="atLeast"/>
+        </w:trPr>
+        <w:tc>
+          <w:tcPr>
+            <w:tcW w:type="dxa" w:w="9360"/>
+          </w:tcPr>
+          <w:p>
+            <w:pPr>
+              <w:jc w:val="center"/>
+            </w:pPr>
+            <w:r/>
+            <w:r>
+              <w:drawing>
+                <wp:inline xmlns:a="http://schemas.openxmlformats.org/drawingml/2006/main" xmlns:pic="http://schemas.openxmlformats.org/drawingml/2006/picture">
+                  <wp:extent cx="5577840" cy="3486150"/>
+                  <wp:docPr id="8" name="Picture 8"/>
+                  <wp:cNvGraphicFramePr>
+                    <a:graphicFrameLocks noChangeAspect="1"/>
+                  </wp:cNvGraphicFramePr>
+                  <a:graphic>
+                    <a:graphicData uri="http://schemas.openxmlformats.org/drawingml/2006/picture">
+                      <pic:pic>
+                        <pic:nvPicPr>
+                          <pic:cNvPr id="0" name="G_busqueda.png"/>
+                          <pic:cNvPicPr/>
+                        </pic:nvPicPr>
+                        <pic:blipFill>
+                          <a:blip r:embed="rId16"/>
+                          <a:stretch>
+                            <a:fillRect/>
+                          </a:stretch>
+                        </pic:blipFill>
+                        <pic:spPr>
+                          <a:xfrm>
+                            <a:off x="0" y="0"/>
+                            <a:ext cx="5577840" cy="3486150"/>
+                          </a:xfrm>
+                          <a:prstGeom prst="rect"/>
+                        </pic:spPr>
+                      </pic:pic>
+                    </a:graphicData>
+                  </a:graphic>
+                </wp:inline>
+              </w:drawing>
+            </w:r>
+          </w:p>
+        </w:tc>
+      </w:tr>
+    </w:tbl>
+    <w:p>
+      <w:pPr>
+        <w:spacing w:after="120"/>
+      </w:pPr>
+    </w:p>
+    <w:p>
+      <w:pPr>
+        <w:pStyle w:val="Heading2"/>
+      </w:pPr>
+      <w:r>
+        <w:t>Anexo H. Reporte de Productos (PDF)</w:t>
+      </w:r>
+    </w:p>
+    <w:tbl>
+      <w:tblPr>
+        <w:tblStyle w:val="TableGrid"/>
+        <w:tblW w:type="auto" w:w="0"/>
+        <w:jc w:val="center"/>
+        <w:tblLayout w:type="fixed"/>
+        <w:tblLook w:firstColumn="1" w:firstRow="1" w:lastColumn="0" w:lastRow="0" w:noHBand="0" w:noVBand="1" w:val="04A0"/>
+      </w:tblPr>
+      <w:tblGrid>
+        <w:gridCol w:w="9360"/>
+      </w:tblGrid>
+      <w:tr>
+        <w:trPr>
+          <w:trHeight w:val="3600" w:hRule="atLeast"/>
+        </w:trPr>
+        <w:tc>
+          <w:tcPr>
+            <w:tcW w:type="dxa" w:w="9360"/>
+          </w:tcPr>
+          <w:p>
+            <w:pPr>
+              <w:jc w:val="center"/>
+            </w:pPr>
+            <w:r/>
+            <w:r>
+              <w:drawing>
+                <wp:inline xmlns:a="http://schemas.openxmlformats.org/drawingml/2006/main" xmlns:pic="http://schemas.openxmlformats.org/drawingml/2006/picture">
+                  <wp:extent cx="5577840" cy="7893347"/>
+                  <wp:docPr id="9" name="Picture 9"/>
+                  <wp:cNvGraphicFramePr>
+                    <a:graphicFrameLocks noChangeAspect="1"/>
+                  </wp:cNvGraphicFramePr>
+                  <a:graphic>
+                    <a:graphicData uri="http://schemas.openxmlformats.org/drawingml/2006/picture">
+                      <pic:pic>
+                        <pic:nvPicPr>
+                          <pic:cNvPr id="0" name="H_reporte.png"/>
+                          <pic:cNvPicPr/>
+                        </pic:nvPicPr>
+                        <pic:blipFill>
+                          <a:blip r:embed="rId17"/>
+                          <a:stretch>
+                            <a:fillRect/>
+                          </a:stretch>
+                        </pic:blipFill>
+                        <pic:spPr>
+                          <a:xfrm>
+                            <a:off x="0" y="0"/>
+                            <a:ext cx="5577840" cy="7893347"/>
+                          </a:xfrm>
+                          <a:prstGeom prst="rect"/>
+                        </pic:spPr>
+                      </pic:pic>
+                    </a:graphicData>
+                  </a:graphic>
+                </wp:inline>
+              </w:drawing>
+            </w:r>
+          </w:p>
+        </w:tc>
+      </w:tr>
+    </w:tbl>
+    <w:p>
+      <w:pPr>
+        <w:spacing w:after="120"/>
+      </w:pPr>
+    </w:p>
+    <w:p>
+      <w:pPr>
+        <w:pStyle w:val="Heading2"/>
+      </w:pPr>
+      <w:r>
+        <w:t>Anexo I. Reporte de Empleados (PDF)</w:t>
+      </w:r>
+    </w:p>
+    <w:p>
+      <w:pPr>
+        <w:jc w:val="center"/>
+      </w:pPr>
+      <w:r>
+        <w:drawing>
+          <wp:inline xmlns:a="http://schemas.openxmlformats.org/drawingml/2006/main" xmlns:pic="http://schemas.openxmlformats.org/drawingml/2006/picture">
+            <wp:extent cx="5577840" cy="7893347"/>
+            <wp:docPr id="10" name="Picture 10"/>
+            <wp:cNvGraphicFramePr>
+              <a:graphicFrameLocks noChangeAspect="1"/>
+            </wp:cNvGraphicFramePr>
+            <a:graphic>
+              <a:graphicData uri="http://schemas.openxmlformats.org/drawingml/2006/picture">
+                <pic:pic>
+                  <pic:nvPicPr>
+                    <pic:cNvPr id="0" name="I_reporte_empleados.png"/>
+                    <pic:cNvPicPr/>
+                  </pic:nvPicPr>
+                  <pic:blipFill>
+                    <a:blip r:embed="rId18"/>
+                    <a:stretch>
+                      <a:fillRect/>
+                    </a:stretch>
+                  </pic:blipFill>
+                  <pic:spPr>
+                    <a:xfrm>
+                      <a:off x="0" y="0"/>
+                      <a:ext cx="5577840" cy="7893347"/>
+                    </a:xfrm>
+                    <a:prstGeom prst="rect"/>
+                  </pic:spPr>
+                </pic:pic>
+              </a:graphicData>
+            </a:graphic>
+          </wp:inline>
+        </w:drawing>
       </w:r>
     </w:p>
     <w:sectPr>

</xml_diff>